<commit_message>
new cv and other changes
</commit_message>
<xml_diff>
--- a/assets/cv/Lorenzo_Marinelli_CV_EN.docx
+++ b/assets/cv/Lorenzo_Marinelli_CV_EN.docx
@@ -4,21 +4,8 @@
   <w:body>
     <w:p>
       <w:pPr>
-        <w:spacing w:before="0" w:after="40" w:line="240" w:lineRule="auto"/>
-      </w:pPr>
-      <w:r>
-        <w:rPr>
-          <w:rFonts w:ascii="Arial" w:hAnsi="Arial" w:cs="Arial"/>
-          <w:b/>
-          <w:color w:val="C10030"/>
-          <w:sz w:val="16"/>
-        </w:rPr>
-        <w:t>CURRICULUM VITAE | JUNE 2026</w:t>
-      </w:r>
-    </w:p>
-    <w:p>
-      <w:pPr>
-        <w:pStyle w:val="Title"/>
+        <w:pStyle w:val="CVName"/>
+        <w:jc w:val="left"/>
       </w:pPr>
       <w:r>
         <w:t>Lorenzo Marinelli</w:t>
@@ -26,1120 +13,2084 @@
     </w:p>
     <w:p>
       <w:pPr>
-        <w:pStyle w:val="Subtitle"/>
+        <w:pStyle w:val="CVSubtitle"/>
+        <w:jc w:val="left"/>
       </w:pPr>
       <w:r>
-        <w:t>MSc Computer Science Student | Applied AI &amp; Scientific Computing</w:t>
+        <w:t>Curriculum Vitae</w:t>
+      </w:r>
+    </w:p>
+    <w:tbl>
+      <w:tblPr>
+        <w:tblW w:type="auto" w:w="0"/>
+        <w:jc w:val="left"/>
+        <w:tblLayout w:type="fixed"/>
+        <w:tblLook w:firstColumn="1" w:firstRow="1" w:lastColumn="0" w:lastRow="0" w:noHBand="0" w:noVBand="1" w:val="04A0"/>
+        <w:tblBorders>
+          <w:top w:val="nil"/>
+          <w:left w:val="nil"/>
+          <w:bottom w:val="nil"/>
+          <w:right w:val="nil"/>
+          <w:insideH w:val="nil"/>
+          <w:insideV w:val="nil"/>
+        </w:tblBorders>
+      </w:tblPr>
+      <w:tblGrid>
+        <w:gridCol w:w="10091"/>
+      </w:tblGrid>
+      <w:tr>
+        <w:tc>
+          <w:tcPr>
+            <w:tcW w:type="dxa" w:w="10091"/>
+            <w:vAlign w:val="center"/>
+            <w:shd w:fill="F3F7FA"/>
+            <w:tcBorders>
+              <w:left w:val="single" w:sz="18" w:space="0" w:color="1F4E79"/>
+              <w:top w:val="nil"/>
+              <w:bottom w:val="nil"/>
+              <w:right w:val="nil"/>
+            </w:tcBorders>
+            <w:tcMar>
+              <w:top w:w="85" w:type="dxa"/>
+              <w:start w:w="180" w:type="dxa"/>
+              <w:bottom w:w="80" w:type="dxa"/>
+              <w:end w:w="160" w:type="dxa"/>
+            </w:tcMar>
+          </w:tcPr>
+          <w:p>
+            <w:pPr>
+              <w:spacing w:after="44" w:line="240" w:lineRule="auto"/>
+              <w:jc w:val="left"/>
+            </w:pPr>
+            <w:r>
+              <w:rPr>
+                <w:rFonts w:ascii="Arial" w:hAnsi="Arial"/>
+                <w:color w:val="1E2A35"/>
+                <w:sz w:val="17"/>
+              </w:rPr>
+              <w:t>Rome, Italy</w:t>
+            </w:r>
+            <w:r>
+              <w:rPr>
+                <w:rFonts w:ascii="Arial" w:hAnsi="Arial"/>
+                <w:color w:val="666666"/>
+                <w:sz w:val="17"/>
+              </w:rPr>
+              <w:t xml:space="preserve">   |   +39 366 462 9271   |   </w:t>
+            </w:r>
+            <w:hyperlink r:id="rId9">
+              <w:r>
+                <w:rPr>
+                  <w:rFonts w:ascii="Arial" w:hAnsi="Arial"/>
+                  <w:color w:val="1F4E79"/>
+                  <w:sz w:val="18"/>
+                </w:rPr>
+                <w:t>lorenzo03.marinelli@gmail.com</w:t>
+              </w:r>
+            </w:hyperlink>
+          </w:p>
+          <w:p>
+            <w:pPr>
+              <w:spacing w:after="0" w:line="240" w:lineRule="auto"/>
+              <w:jc w:val="left"/>
+            </w:pPr>
+            <w:hyperlink r:id="rId10">
+              <w:r>
+                <w:rPr>
+                  <w:rFonts w:ascii="Arial" w:hAnsi="Arial"/>
+                  <w:color w:val="1F4E79"/>
+                  <w:sz w:val="18"/>
+                </w:rPr>
+                <w:t>www.lmarinelli.eu</w:t>
+              </w:r>
+            </w:hyperlink>
+            <w:r>
+              <w:rPr>
+                <w:rFonts w:ascii="Arial" w:hAnsi="Arial"/>
+                <w:color w:val="666666"/>
+                <w:sz w:val="17"/>
+              </w:rPr>
+              <w:t xml:space="preserve">   |   </w:t>
+            </w:r>
+            <w:hyperlink r:id="rId11">
+              <w:r>
+                <w:rPr>
+                  <w:rFonts w:ascii="Arial" w:hAnsi="Arial"/>
+                  <w:color w:val="1F4E79"/>
+                  <w:sz w:val="18"/>
+                </w:rPr>
+                <w:t>GitHub</w:t>
+              </w:r>
+            </w:hyperlink>
+            <w:r>
+              <w:rPr>
+                <w:rFonts w:ascii="Arial" w:hAnsi="Arial"/>
+                <w:color w:val="666666"/>
+                <w:sz w:val="17"/>
+              </w:rPr>
+              <w:t xml:space="preserve">   |   </w:t>
+            </w:r>
+            <w:hyperlink r:id="rId12">
+              <w:r>
+                <w:rPr>
+                  <w:rFonts w:ascii="Arial" w:hAnsi="Arial"/>
+                  <w:color w:val="1F4E79"/>
+                  <w:sz w:val="18"/>
+                </w:rPr>
+                <w:t>LinkedIn</w:t>
+              </w:r>
+            </w:hyperlink>
+          </w:p>
+        </w:tc>
+      </w:tr>
+    </w:tbl>
+    <w:p>
+      <w:pPr>
+        <w:pStyle w:val="CVSection"/>
+        <w:keepNext/>
+        <w:pBdr>
+          <w:bottom w:val="single" w:sz="8" w:space="1" w:color="1F4E79"/>
+        </w:pBdr>
+        <w:spacing w:before="150" w:after="60"/>
+      </w:pPr>
+      <w:r>
+        <w:t>ABOUT ME</w:t>
+      </w:r>
+    </w:p>
+    <w:tbl>
+      <w:tblPr>
+        <w:tblW w:type="auto" w:w="0"/>
+        <w:tblLayout w:type="fixed"/>
+        <w:tblLook w:firstColumn="1" w:firstRow="1" w:lastColumn="0" w:lastRow="0" w:noHBand="0" w:noVBand="1" w:val="04A0"/>
+        <w:tblBorders>
+          <w:top w:val="nil"/>
+          <w:left w:val="nil"/>
+          <w:bottom w:val="nil"/>
+          <w:right w:val="nil"/>
+          <w:insideH w:val="nil"/>
+          <w:insideV w:val="nil"/>
+        </w:tblBorders>
+      </w:tblPr>
+      <w:tblGrid>
+        <w:gridCol w:w="1899"/>
+        <w:gridCol w:w="8107"/>
+      </w:tblGrid>
+      <w:tr>
+        <w:trPr>
+          <w:cantSplit/>
+        </w:trPr>
+        <w:tc>
+          <w:tcPr>
+            <w:tcW w:type="dxa" w:w="1899"/>
+            <w:tcMar>
+              <w:top w:w="20" w:type="dxa"/>
+              <w:start w:w="0" w:type="dxa"/>
+              <w:bottom w:w="0" w:type="dxa"/>
+              <w:end w:w="160" w:type="dxa"/>
+            </w:tcMar>
+          </w:tcPr>
+          <w:p>
+            <w:pPr>
+              <w:pStyle w:val="CVMeta"/>
+              <w:widowControl/>
+              <w:jc w:val="right"/>
+            </w:pPr>
+            <w:r>
+              <w:rPr>
+                <w:b/>
+                <w:color w:val="1F4E79"/>
+              </w:rPr>
+              <w:t>Research profile</w:t>
+            </w:r>
+          </w:p>
+        </w:tc>
+        <w:tc>
+          <w:tcPr>
+            <w:tcW w:type="dxa" w:w="8107"/>
+            <w:tcMar>
+              <w:top w:w="20" w:type="dxa"/>
+              <w:start w:w="90" w:type="dxa"/>
+              <w:bottom w:w="0" w:type="dxa"/>
+              <w:end w:w="0" w:type="dxa"/>
+            </w:tcMar>
+          </w:tcPr>
+          <w:p>
+            <w:pPr>
+              <w:widowControl/>
+            </w:pPr>
+            <w:r>
+              <w:t>MSc student in Computer Science at Sapienza University of Rome, with a BSc in Applied Computer Science and Artificial Intelligence awarded with highest honours. Research interests include graph representation learning, bioinformatics, computer vision, adversarial machine learning, and the robustness and reliability of machine-learning models. Experience includes end-to-end experimental pipelines, quantitative evaluation, reproducible software development, and deployment-oriented prototyping.</w:t>
+            </w:r>
+          </w:p>
+        </w:tc>
+      </w:tr>
+    </w:tbl>
+    <w:p>
+      <w:pPr>
+        <w:pStyle w:val="CVSection"/>
+        <w:keepNext/>
+        <w:pBdr>
+          <w:bottom w:val="single" w:sz="8" w:space="1" w:color="1F4E79"/>
+        </w:pBdr>
+      </w:pPr>
+      <w:r>
+        <w:t>EDUCATION AND TRAINING</w:t>
+      </w:r>
+    </w:p>
+    <w:tbl>
+      <w:tblPr>
+        <w:tblW w:type="auto" w:w="0"/>
+        <w:jc w:val="center"/>
+        <w:tblLayout w:type="fixed"/>
+        <w:tblLook w:firstColumn="1" w:firstRow="1" w:lastColumn="0" w:lastRow="0" w:noHBand="0" w:noVBand="1" w:val="04A0"/>
+        <w:tblBorders>
+          <w:top w:val="nil"/>
+          <w:left w:val="nil"/>
+          <w:bottom w:val="nil"/>
+          <w:right w:val="nil"/>
+          <w:insideH w:val="nil"/>
+          <w:insideV w:val="nil"/>
+        </w:tblBorders>
+      </w:tblPr>
+      <w:tblGrid>
+        <w:gridCol w:w="1899"/>
+        <w:gridCol w:w="8107"/>
+      </w:tblGrid>
+      <w:tr>
+        <w:trPr>
+          <w:cantSplit/>
+        </w:trPr>
+        <w:tc>
+          <w:tcPr>
+            <w:tcW w:type="dxa" w:w="1899"/>
+            <w:vAlign w:val="top"/>
+            <w:tcMar>
+              <w:top w:w="40" w:type="dxa"/>
+              <w:start w:w="0" w:type="dxa"/>
+              <w:bottom w:w="20" w:type="dxa"/>
+              <w:end w:w="160" w:type="dxa"/>
+            </w:tcMar>
+          </w:tcPr>
+          <w:p>
+            <w:pPr>
+              <w:pStyle w:val="CVMeta"/>
+              <w:widowControl/>
+              <w:jc w:val="right"/>
+            </w:pPr>
+            <w:r>
+              <w:rPr>
+                <w:b/>
+                <w:color w:val="1F4E79"/>
+              </w:rPr>
+              <w:t>2025-present</w:t>
+            </w:r>
+          </w:p>
+        </w:tc>
+        <w:tc>
+          <w:tcPr>
+            <w:tcW w:type="dxa" w:w="8107"/>
+            <w:vAlign w:val="top"/>
+            <w:tcMar>
+              <w:top w:w="40" w:type="dxa"/>
+              <w:start w:w="90" w:type="dxa"/>
+              <w:bottom w:w="20" w:type="dxa"/>
+              <w:end w:w="0" w:type="dxa"/>
+            </w:tcMar>
+          </w:tcPr>
+          <w:p>
+            <w:pPr>
+              <w:pStyle w:val="CVItemTitle"/>
+              <w:keepNext/>
+              <w:widowControl/>
+            </w:pPr>
+            <w:r>
+              <w:t>MSc in Computer Science</w:t>
+            </w:r>
+          </w:p>
+          <w:p>
+            <w:pPr>
+              <w:pStyle w:val="CVMeta"/>
+              <w:keepNext/>
+              <w:widowControl/>
+            </w:pPr>
+            <w:r>
+              <w:t>Sapienza University of Rome</w:t>
+            </w:r>
+          </w:p>
+          <w:p>
+            <w:pPr>
+              <w:widowControl/>
+              <w:spacing w:after="30"/>
+            </w:pPr>
+            <w:r>
+              <w:t>Graduate studies in computer science with particular interest in deep learning, graph-based methods, robust evaluation, and research software engineering.</w:t>
+            </w:r>
+          </w:p>
+        </w:tc>
+      </w:tr>
+    </w:tbl>
+    <w:tbl>
+      <w:tblPr>
+        <w:tblW w:type="auto" w:w="0"/>
+        <w:jc w:val="center"/>
+        <w:tblLayout w:type="fixed"/>
+        <w:tblLook w:firstColumn="1" w:firstRow="1" w:lastColumn="0" w:lastRow="0" w:noHBand="0" w:noVBand="1" w:val="04A0"/>
+        <w:tblBorders>
+          <w:top w:val="nil"/>
+          <w:left w:val="nil"/>
+          <w:bottom w:val="nil"/>
+          <w:right w:val="nil"/>
+          <w:insideH w:val="nil"/>
+          <w:insideV w:val="nil"/>
+        </w:tblBorders>
+      </w:tblPr>
+      <w:tblGrid>
+        <w:gridCol w:w="1899"/>
+        <w:gridCol w:w="8107"/>
+      </w:tblGrid>
+      <w:tr>
+        <w:trPr>
+          <w:cantSplit/>
+        </w:trPr>
+        <w:tc>
+          <w:tcPr>
+            <w:tcW w:type="dxa" w:w="1899"/>
+            <w:vAlign w:val="top"/>
+            <w:tcMar>
+              <w:top w:w="40" w:type="dxa"/>
+              <w:start w:w="0" w:type="dxa"/>
+              <w:bottom w:w="20" w:type="dxa"/>
+              <w:end w:w="160" w:type="dxa"/>
+            </w:tcMar>
+          </w:tcPr>
+          <w:p>
+            <w:pPr>
+              <w:pStyle w:val="CVMeta"/>
+              <w:widowControl/>
+              <w:jc w:val="right"/>
+            </w:pPr>
+            <w:r>
+              <w:rPr>
+                <w:b/>
+                <w:color w:val="1F4E79"/>
+              </w:rPr>
+              <w:t>2022-2025</w:t>
+            </w:r>
+          </w:p>
+        </w:tc>
+        <w:tc>
+          <w:tcPr>
+            <w:tcW w:type="dxa" w:w="8107"/>
+            <w:vAlign w:val="top"/>
+            <w:tcMar>
+              <w:top w:w="40" w:type="dxa"/>
+              <w:start w:w="90" w:type="dxa"/>
+              <w:bottom w:w="20" w:type="dxa"/>
+              <w:end w:w="0" w:type="dxa"/>
+            </w:tcMar>
+          </w:tcPr>
+          <w:p>
+            <w:pPr>
+              <w:pStyle w:val="CVItemTitle"/>
+              <w:keepNext/>
+              <w:widowControl/>
+            </w:pPr>
+            <w:r>
+              <w:t>BSc in Applied Computer Science and Artificial Intelligence</w:t>
+            </w:r>
+          </w:p>
+          <w:p>
+            <w:pPr>
+              <w:pStyle w:val="CVMeta"/>
+              <w:keepNext/>
+              <w:widowControl/>
+            </w:pPr>
+            <w:r>
+              <w:t>Sapienza University of Rome</w:t>
+            </w:r>
+          </w:p>
+          <w:p>
+            <w:pPr>
+              <w:widowControl/>
+              <w:spacing w:after="30"/>
+            </w:pPr>
+            <w:r>
+              <w:t>Degree awarded 110/110 cum laude. English-taught programme, class L-31. Bachelor thesis on graph-neural-network link prediction in protein-protein interaction networks.</w:t>
+            </w:r>
+          </w:p>
+        </w:tc>
+      </w:tr>
+    </w:tbl>
+    <w:tbl>
+      <w:tblPr>
+        <w:tblW w:type="auto" w:w="0"/>
+        <w:jc w:val="center"/>
+        <w:tblLayout w:type="fixed"/>
+        <w:tblLook w:firstColumn="1" w:firstRow="1" w:lastColumn="0" w:lastRow="0" w:noHBand="0" w:noVBand="1" w:val="04A0"/>
+        <w:tblBorders>
+          <w:top w:val="nil"/>
+          <w:left w:val="nil"/>
+          <w:bottom w:val="nil"/>
+          <w:right w:val="nil"/>
+          <w:insideH w:val="nil"/>
+          <w:insideV w:val="nil"/>
+        </w:tblBorders>
+      </w:tblPr>
+      <w:tblGrid>
+        <w:gridCol w:w="1899"/>
+        <w:gridCol w:w="8107"/>
+      </w:tblGrid>
+      <w:tr>
+        <w:trPr>
+          <w:cantSplit/>
+        </w:trPr>
+        <w:tc>
+          <w:tcPr>
+            <w:tcW w:type="dxa" w:w="1899"/>
+            <w:vAlign w:val="top"/>
+            <w:tcMar>
+              <w:top w:w="40" w:type="dxa"/>
+              <w:start w:w="0" w:type="dxa"/>
+              <w:bottom w:w="20" w:type="dxa"/>
+              <w:end w:w="160" w:type="dxa"/>
+            </w:tcMar>
+          </w:tcPr>
+          <w:p>
+            <w:pPr>
+              <w:pStyle w:val="CVMeta"/>
+              <w:widowControl/>
+              <w:jc w:val="right"/>
+            </w:pPr>
+            <w:r>
+              <w:rPr>
+                <w:b/>
+                <w:color w:val="1F4E79"/>
+              </w:rPr>
+              <w:t>2017-2022</w:t>
+            </w:r>
+          </w:p>
+        </w:tc>
+        <w:tc>
+          <w:tcPr>
+            <w:tcW w:type="dxa" w:w="8107"/>
+            <w:vAlign w:val="top"/>
+            <w:tcMar>
+              <w:top w:w="40" w:type="dxa"/>
+              <w:start w:w="90" w:type="dxa"/>
+              <w:bottom w:w="20" w:type="dxa"/>
+              <w:end w:w="0" w:type="dxa"/>
+            </w:tcMar>
+          </w:tcPr>
+          <w:p>
+            <w:pPr>
+              <w:pStyle w:val="CVItemTitle"/>
+              <w:keepNext/>
+              <w:widowControl/>
+            </w:pPr>
+            <w:r>
+              <w:t>Scientific High School Diploma</w:t>
+            </w:r>
+          </w:p>
+          <w:p>
+            <w:pPr>
+              <w:pStyle w:val="CVMeta"/>
+              <w:keepNext/>
+              <w:widowControl/>
+            </w:pPr>
+            <w:r>
+              <w:t>Liceo Scientifico Statale "A. Romita", Campobasso</w:t>
+            </w:r>
+          </w:p>
+          <w:p>
+            <w:pPr>
+              <w:widowControl/>
+              <w:spacing w:after="30"/>
+            </w:pPr>
+            <w:r>
+              <w:t>Diploma awarded 100/100 cum laude.</w:t>
+            </w:r>
+          </w:p>
+        </w:tc>
+      </w:tr>
+    </w:tbl>
+    <w:p>
+      <w:pPr>
+        <w:pStyle w:val="CVSection"/>
+        <w:keepNext/>
+        <w:pBdr>
+          <w:bottom w:val="single" w:sz="8" w:space="1" w:color="1F4E79"/>
+        </w:pBdr>
+      </w:pPr>
+      <w:r>
+        <w:t>RESEARCH EXPERIENCE</w:t>
+      </w:r>
+    </w:p>
+    <w:tbl>
+      <w:tblPr>
+        <w:tblW w:type="auto" w:w="0"/>
+        <w:jc w:val="center"/>
+        <w:tblLayout w:type="fixed"/>
+        <w:tblLook w:firstColumn="1" w:firstRow="1" w:lastColumn="0" w:lastRow="0" w:noHBand="0" w:noVBand="1" w:val="04A0"/>
+        <w:tblBorders>
+          <w:top w:val="nil"/>
+          <w:left w:val="nil"/>
+          <w:bottom w:val="nil"/>
+          <w:right w:val="nil"/>
+          <w:insideH w:val="nil"/>
+          <w:insideV w:val="nil"/>
+        </w:tblBorders>
+      </w:tblPr>
+      <w:tblGrid>
+        <w:gridCol w:w="1899"/>
+        <w:gridCol w:w="8107"/>
+      </w:tblGrid>
+      <w:tr>
+        <w:trPr>
+          <w:cantSplit/>
+        </w:trPr>
+        <w:tc>
+          <w:tcPr>
+            <w:tcW w:type="dxa" w:w="1899"/>
+            <w:vAlign w:val="top"/>
+            <w:tcMar>
+              <w:top w:w="40" w:type="dxa"/>
+              <w:start w:w="0" w:type="dxa"/>
+              <w:bottom w:w="20" w:type="dxa"/>
+              <w:end w:w="160" w:type="dxa"/>
+            </w:tcMar>
+          </w:tcPr>
+          <w:p>
+            <w:pPr>
+              <w:pStyle w:val="CVMeta"/>
+              <w:widowControl/>
+              <w:jc w:val="right"/>
+            </w:pPr>
+            <w:r>
+              <w:rPr>
+                <w:b/>
+                <w:color w:val="1F4E79"/>
+              </w:rPr>
+              <w:t>2024-2025</w:t>
+            </w:r>
+          </w:p>
+        </w:tc>
+        <w:tc>
+          <w:tcPr>
+            <w:tcW w:type="dxa" w:w="8107"/>
+            <w:vAlign w:val="top"/>
+            <w:tcMar>
+              <w:top w:w="40" w:type="dxa"/>
+              <w:start w:w="90" w:type="dxa"/>
+              <w:bottom w:w="20" w:type="dxa"/>
+              <w:end w:w="0" w:type="dxa"/>
+            </w:tcMar>
+          </w:tcPr>
+          <w:p>
+            <w:pPr>
+              <w:pStyle w:val="CVItemTitle"/>
+              <w:keepNext/>
+              <w:widowControl/>
+            </w:pPr>
+            <w:r>
+              <w:t>Bachelor's Thesis: Protein Interaction Link Prediction</w:t>
+            </w:r>
+          </w:p>
+          <w:p>
+            <w:pPr>
+              <w:pStyle w:val="CVMeta"/>
+              <w:keepNext/>
+              <w:widowControl/>
+            </w:pPr>
+            <w:r>
+              <w:t>Unveiling Protein Connections through Graph Neural Networks and ProtT5 Embeddings</w:t>
+            </w:r>
+          </w:p>
+          <w:p>
+            <w:pPr>
+              <w:widowControl/>
+              <w:spacing w:after="14"/>
+              <w:ind w:left="198" w:hanging="113"/>
+            </w:pPr>
+            <w:r>
+              <w:rPr>
+                <w:color w:val="1F4E79"/>
+              </w:rPr>
+              <w:t xml:space="preserve">• </w:t>
+            </w:r>
+            <w:r>
+              <w:t>Developed an end-to-end pipeline for protein-protein interaction prediction using STRING v12 data, ProtT5 sequence embeddings, and graph neural networks.</w:t>
+            </w:r>
+          </w:p>
+          <w:p>
+            <w:pPr>
+              <w:widowControl/>
+              <w:spacing w:after="14"/>
+              <w:ind w:left="198" w:hanging="113"/>
+            </w:pPr>
+            <w:r>
+              <w:rPr>
+                <w:color w:val="1F4E79"/>
+              </w:rPr>
+              <w:t xml:space="preserve">• </w:t>
+            </w:r>
+            <w:r>
+              <w:t>Combined TAGConv, multi-head TransformerConv, and GIN layers with a pairwise decoder; implemented negative sampling, class weighting, edge-dropout augmentation, and reproducible evaluation.</w:t>
+            </w:r>
+          </w:p>
+          <w:p>
+            <w:pPr>
+              <w:widowControl/>
+              <w:spacing w:after="14"/>
+              <w:ind w:left="198" w:hanging="113"/>
+            </w:pPr>
+            <w:r>
+              <w:rPr>
+                <w:color w:val="1F4E79"/>
+              </w:rPr>
+              <w:t xml:space="preserve">• </w:t>
+            </w:r>
+            <w:r>
+              <w:t>Achieved 0.96 AUROC, recovered 81% of withheld positive interactions, and obtained P@500 = 1.00; examined threshold selection, class imbalance, and topology-driven bias.</w:t>
+            </w:r>
+          </w:p>
+          <w:p>
+            <w:pPr>
+              <w:widowControl/>
+              <w:spacing w:after="14"/>
+              <w:ind w:left="198" w:hanging="113"/>
+            </w:pPr>
+            <w:r>
+              <w:rPr>
+                <w:color w:val="1F4E79"/>
+              </w:rPr>
+              <w:t xml:space="preserve">• </w:t>
+            </w:r>
+            <w:r>
+              <w:t>Conducted a NOTCH2 case study to rank biologically plausible interaction candidates and documented methodological limitations and robustness-oriented future work.</w:t>
+            </w:r>
+          </w:p>
+        </w:tc>
+      </w:tr>
+    </w:tbl>
+    <w:p>
+      <w:pPr>
+        <w:pStyle w:val="CVSection"/>
+        <w:keepNext/>
+        <w:pBdr>
+          <w:bottom w:val="single" w:sz="8" w:space="1" w:color="1F4E79"/>
+        </w:pBdr>
+      </w:pPr>
+      <w:r>
+        <w:t>SELECTED PROJECTS</w:t>
+      </w:r>
+    </w:p>
+    <w:tbl>
+      <w:tblPr>
+        <w:tblW w:type="auto" w:w="0"/>
+        <w:jc w:val="center"/>
+        <w:tblLayout w:type="fixed"/>
+        <w:tblLook w:firstColumn="1" w:firstRow="1" w:lastColumn="0" w:lastRow="0" w:noHBand="0" w:noVBand="1" w:val="04A0"/>
+        <w:tblBorders>
+          <w:top w:val="nil"/>
+          <w:left w:val="nil"/>
+          <w:bottom w:val="nil"/>
+          <w:right w:val="nil"/>
+          <w:insideH w:val="nil"/>
+          <w:insideV w:val="nil"/>
+        </w:tblBorders>
+      </w:tblPr>
+      <w:tblGrid>
+        <w:gridCol w:w="1899"/>
+        <w:gridCol w:w="8107"/>
+      </w:tblGrid>
+      <w:tr>
+        <w:trPr>
+          <w:cantSplit/>
+        </w:trPr>
+        <w:tc>
+          <w:tcPr>
+            <w:tcW w:type="dxa" w:w="1899"/>
+            <w:vAlign w:val="top"/>
+            <w:tcMar>
+              <w:top w:w="40" w:type="dxa"/>
+              <w:start w:w="0" w:type="dxa"/>
+              <w:bottom w:w="20" w:type="dxa"/>
+              <w:end w:w="160" w:type="dxa"/>
+            </w:tcMar>
+          </w:tcPr>
+          <w:p>
+            <w:pPr>
+              <w:pStyle w:val="CVMeta"/>
+              <w:widowControl/>
+              <w:jc w:val="right"/>
+            </w:pPr>
+            <w:r>
+              <w:rPr>
+                <w:b/>
+                <w:color w:val="1F4E79"/>
+              </w:rPr>
+              <w:t>Adversarial ML</w:t>
+            </w:r>
+          </w:p>
+        </w:tc>
+        <w:tc>
+          <w:tcPr>
+            <w:tcW w:type="dxa" w:w="8107"/>
+            <w:vAlign w:val="top"/>
+            <w:tcMar>
+              <w:top w:w="40" w:type="dxa"/>
+              <w:start w:w="90" w:type="dxa"/>
+              <w:bottom w:w="20" w:type="dxa"/>
+              <w:end w:w="0" w:type="dxa"/>
+            </w:tcMar>
+          </w:tcPr>
+          <w:p>
+            <w:pPr>
+              <w:pStyle w:val="CVItemTitle"/>
+              <w:keepNext/>
+              <w:widowControl/>
+            </w:pPr>
+            <w:r>
+              <w:t>NoWhisper: Adversarial Robustness of Speech Recognition</w:t>
+            </w:r>
+          </w:p>
+          <w:p>
+            <w:pPr>
+              <w:widowControl/>
+              <w:spacing w:after="14"/>
+              <w:ind w:left="198" w:hanging="113"/>
+            </w:pPr>
+            <w:r>
+              <w:rPr>
+                <w:color w:val="1F4E79"/>
+              </w:rPr>
+              <w:t xml:space="preserve">• </w:t>
+            </w:r>
+            <w:r>
+              <w:t>Co-developed a framework for studying untargeted adversarial perturbations against Whisper, with the objective of degrading automatic transcription while preserving the intelligibility of the underlying speech.</w:t>
+            </w:r>
+          </w:p>
+          <w:p>
+            <w:pPr>
+              <w:widowControl/>
+              <w:spacing w:after="14"/>
+              <w:ind w:left="198" w:hanging="113"/>
+            </w:pPr>
+            <w:r>
+              <w:rPr>
+                <w:color w:val="1F4E79"/>
+              </w:rPr>
+              <w:t xml:space="preserve">• </w:t>
+            </w:r>
+            <w:r>
+              <w:t>Implemented sample-specific white-box attacks and training for a reusable neural perturbation generator, including amplitude constraints and robustness-oriented audio transformations.</w:t>
+            </w:r>
+          </w:p>
+          <w:p>
+            <w:pPr>
+              <w:widowControl/>
+              <w:spacing w:after="14"/>
+              <w:ind w:left="198" w:hanging="113"/>
+            </w:pPr>
+            <w:r>
+              <w:rPr>
+                <w:color w:val="1F4E79"/>
+              </w:rPr>
+              <w:t xml:space="preserve">• </w:t>
+            </w:r>
+            <w:r>
+              <w:t>Built reproducible LibriSpeech preparation, evaluation, and reporting workflows using word and character error rates, together with command-line tools and an interactive interface for attack analysis.</w:t>
+            </w:r>
+          </w:p>
+        </w:tc>
+      </w:tr>
+    </w:tbl>
+    <w:tbl>
+      <w:tblPr>
+        <w:tblW w:type="auto" w:w="0"/>
+        <w:jc w:val="center"/>
+        <w:tblLayout w:type="fixed"/>
+        <w:tblLook w:firstColumn="1" w:firstRow="1" w:lastColumn="0" w:lastRow="0" w:noHBand="0" w:noVBand="1" w:val="04A0"/>
+        <w:tblBorders>
+          <w:top w:val="nil"/>
+          <w:left w:val="nil"/>
+          <w:bottom w:val="nil"/>
+          <w:right w:val="nil"/>
+          <w:insideH w:val="nil"/>
+          <w:insideV w:val="nil"/>
+        </w:tblBorders>
+      </w:tblPr>
+      <w:tblGrid>
+        <w:gridCol w:w="1899"/>
+        <w:gridCol w:w="8107"/>
+      </w:tblGrid>
+      <w:tr>
+        <w:trPr>
+          <w:cantSplit/>
+        </w:trPr>
+        <w:tc>
+          <w:tcPr>
+            <w:tcW w:type="dxa" w:w="1899"/>
+            <w:vAlign w:val="top"/>
+            <w:tcMar>
+              <w:top w:w="40" w:type="dxa"/>
+              <w:start w:w="0" w:type="dxa"/>
+              <w:bottom w:w="20" w:type="dxa"/>
+              <w:end w:w="160" w:type="dxa"/>
+            </w:tcMar>
+          </w:tcPr>
+          <w:p>
+            <w:pPr>
+              <w:pStyle w:val="CVMeta"/>
+              <w:widowControl/>
+              <w:jc w:val="right"/>
+            </w:pPr>
+            <w:r>
+              <w:rPr>
+                <w:b/>
+                <w:color w:val="1F4E79"/>
+              </w:rPr>
+              <w:t>Reinforcement learning</w:t>
+            </w:r>
+          </w:p>
+        </w:tc>
+        <w:tc>
+          <w:tcPr>
+            <w:tcW w:type="dxa" w:w="8107"/>
+            <w:vAlign w:val="top"/>
+            <w:tcMar>
+              <w:top w:w="40" w:type="dxa"/>
+              <w:start w:w="90" w:type="dxa"/>
+              <w:bottom w:w="20" w:type="dxa"/>
+              <w:end w:w="0" w:type="dxa"/>
+            </w:tcMar>
+          </w:tcPr>
+          <w:p>
+            <w:pPr>
+              <w:pStyle w:val="CVItemTitle"/>
+              <w:keepNext/>
+              <w:widowControl/>
+            </w:pPr>
+            <w:r>
+              <w:t>RL-Nav: Language-Guided Navigation under Partial Observability</w:t>
+            </w:r>
+          </w:p>
+          <w:p>
+            <w:pPr>
+              <w:widowControl/>
+              <w:spacing w:after="14"/>
+              <w:ind w:left="198" w:hanging="113"/>
+            </w:pPr>
+            <w:r>
+              <w:rPr>
+                <w:color w:val="1F4E79"/>
+              </w:rPr>
+              <w:t xml:space="preserve">• </w:t>
+            </w:r>
+            <w:r>
+              <w:t>Developed a stochastic PyBullet navigation environment containing obstacles and hazardous regions, and trained a recurrent PPO agent from partial observations.</w:t>
+            </w:r>
+          </w:p>
+          <w:p>
+            <w:pPr>
+              <w:widowControl/>
+              <w:spacing w:after="14"/>
+              <w:ind w:left="198" w:hanging="113"/>
+            </w:pPr>
+            <w:r>
+              <w:rPr>
+                <w:color w:val="1F4E79"/>
+              </w:rPr>
+              <w:t xml:space="preserve">• </w:t>
+            </w:r>
+            <w:r>
+              <w:t>Integrated an LLM-based oracle that returns constrained TURN/WALK advice, with canonical parsing, query cooldowns, failure handling, and a geometric planner used as a reference policy.</w:t>
+            </w:r>
+          </w:p>
+          <w:p>
+            <w:pPr>
+              <w:widowControl/>
+              <w:spacing w:after="14"/>
+              <w:ind w:left="198" w:hanging="113"/>
+            </w:pPr>
+            <w:r>
+              <w:rPr>
+                <w:color w:val="1F4E79"/>
+              </w:rPr>
+              <w:t xml:space="preserve">• </w:t>
+            </w:r>
+            <w:r>
+              <w:t>Evaluated oracle agreement, navigation success, and the propagation of local instruction errors into long-horizon behaviour, highlighting the gap between plausible language advice and reliable control.</w:t>
+            </w:r>
+          </w:p>
+        </w:tc>
+      </w:tr>
+    </w:tbl>
+    <w:tbl>
+      <w:tblPr>
+        <w:tblW w:type="auto" w:w="0"/>
+        <w:jc w:val="center"/>
+        <w:tblLayout w:type="fixed"/>
+        <w:tblLook w:firstColumn="1" w:firstRow="1" w:lastColumn="0" w:lastRow="0" w:noHBand="0" w:noVBand="1" w:val="04A0"/>
+        <w:tblBorders>
+          <w:top w:val="nil"/>
+          <w:left w:val="nil"/>
+          <w:bottom w:val="nil"/>
+          <w:right w:val="nil"/>
+          <w:insideH w:val="nil"/>
+          <w:insideV w:val="nil"/>
+        </w:tblBorders>
+      </w:tblPr>
+      <w:tblGrid>
+        <w:gridCol w:w="1899"/>
+        <w:gridCol w:w="8107"/>
+      </w:tblGrid>
+      <w:tr>
+        <w:trPr>
+          <w:cantSplit/>
+        </w:trPr>
+        <w:tc>
+          <w:tcPr>
+            <w:tcW w:type="dxa" w:w="1899"/>
+            <w:vAlign w:val="top"/>
+            <w:tcMar>
+              <w:top w:w="40" w:type="dxa"/>
+              <w:start w:w="0" w:type="dxa"/>
+              <w:bottom w:w="20" w:type="dxa"/>
+              <w:end w:w="160" w:type="dxa"/>
+            </w:tcMar>
+          </w:tcPr>
+          <w:p>
+            <w:pPr>
+              <w:pStyle w:val="CVMeta"/>
+              <w:widowControl/>
+              <w:jc w:val="right"/>
+            </w:pPr>
+            <w:r>
+              <w:rPr>
+                <w:b/>
+                <w:color w:val="1F4E79"/>
+              </w:rPr>
+              <w:t>Computer vision</w:t>
+            </w:r>
+          </w:p>
+        </w:tc>
+        <w:tc>
+          <w:tcPr>
+            <w:tcW w:type="dxa" w:w="8107"/>
+            <w:vAlign w:val="top"/>
+            <w:tcMar>
+              <w:top w:w="40" w:type="dxa"/>
+              <w:start w:w="90" w:type="dxa"/>
+              <w:bottom w:w="20" w:type="dxa"/>
+              <w:end w:w="0" w:type="dxa"/>
+            </w:tcMar>
+          </w:tcPr>
+          <w:p>
+            <w:pPr>
+              <w:pStyle w:val="CVItemTitle"/>
+              <w:keepNext/>
+              <w:widowControl/>
+            </w:pPr>
+            <w:r>
+              <w:t>UAV Anomaly Detection and Localization - SASA Flight Team</w:t>
+            </w:r>
+          </w:p>
+          <w:p>
+            <w:pPr>
+              <w:widowControl/>
+              <w:spacing w:after="14"/>
+              <w:ind w:left="198" w:hanging="113"/>
+            </w:pPr>
+            <w:r>
+              <w:rPr>
+                <w:color w:val="1F4E79"/>
+              </w:rPr>
+              <w:t xml:space="preserve">• </w:t>
+            </w:r>
+            <w:r>
+              <w:t>Developed an unsupervised anomaly-detection pipeline for high-resolution aerial imagery using autoencoder and variational-autoencoder reconstruction errors.</w:t>
+            </w:r>
+          </w:p>
+          <w:p>
+            <w:pPr>
+              <w:widowControl/>
+              <w:spacing w:after="14"/>
+              <w:ind w:left="198" w:hanging="113"/>
+            </w:pPr>
+            <w:r>
+              <w:rPr>
+                <w:color w:val="1F4E79"/>
+              </w:rPr>
+              <w:t xml:space="preserve">• </w:t>
+            </w:r>
+            <w:r>
+              <w:t>Converted dense error maps into stable detections through denoising, threshold selection, morphological post-processing, connected-component analysis, and bounding-box extraction.</w:t>
+            </w:r>
+          </w:p>
+          <w:p>
+            <w:pPr>
+              <w:widowControl/>
+              <w:spacing w:after="14"/>
+              <w:ind w:left="198" w:hanging="113"/>
+            </w:pPr>
+            <w:r>
+              <w:rPr>
+                <w:color w:val="1F4E79"/>
+              </w:rPr>
+              <w:t xml:space="preserve">• </w:t>
+            </w:r>
+            <w:r>
+              <w:t>Structured the pipeline for autonomous-aircraft deployment and downstream classification, with emphasis on noisy inputs, edge cases, modular implementation, and quantitative validation.</w:t>
+            </w:r>
+          </w:p>
+        </w:tc>
+      </w:tr>
+    </w:tbl>
+    <w:p>
+      <w:pPr>
+        <w:pStyle w:val="CVSection"/>
+        <w:keepNext/>
+        <w:pBdr>
+          <w:bottom w:val="single" w:sz="8" w:space="1" w:color="1F4E79"/>
+        </w:pBdr>
+      </w:pPr>
+      <w:r>
+        <w:t>DIGITAL AND TECHNICAL SKILLS</w:t>
+      </w:r>
+    </w:p>
+    <w:tbl>
+      <w:tblPr>
+        <w:tblW w:type="auto" w:w="0"/>
+        <w:jc w:val="center"/>
+        <w:tblLayout w:type="fixed"/>
+        <w:tblLook w:firstColumn="1" w:firstRow="1" w:lastColumn="0" w:lastRow="0" w:noHBand="0" w:noVBand="1" w:val="04A0"/>
+        <w:tblBorders>
+          <w:top w:val="nil"/>
+          <w:left w:val="nil"/>
+          <w:bottom w:val="nil"/>
+          <w:right w:val="nil"/>
+          <w:insideH w:val="nil"/>
+          <w:insideV w:val="nil"/>
+        </w:tblBorders>
+      </w:tblPr>
+      <w:tblGrid>
+        <w:gridCol w:w="1899"/>
+        <w:gridCol w:w="8107"/>
+      </w:tblGrid>
+      <w:tr>
+        <w:trPr>
+          <w:cantSplit/>
+        </w:trPr>
+        <w:tc>
+          <w:tcPr>
+            <w:tcW w:type="dxa" w:w="1899"/>
+            <w:tcMar>
+              <w:top w:w="25" w:type="dxa"/>
+              <w:start w:w="0" w:type="dxa"/>
+              <w:bottom w:w="15" w:type="dxa"/>
+              <w:end w:w="160" w:type="dxa"/>
+            </w:tcMar>
+          </w:tcPr>
+          <w:p>
+            <w:pPr>
+              <w:pStyle w:val="CVMeta"/>
+              <w:widowControl/>
+              <w:jc w:val="right"/>
+            </w:pPr>
+            <w:r>
+              <w:rPr>
+                <w:b/>
+                <w:color w:val="1F4E79"/>
+              </w:rPr>
+              <w:t>Programming</w:t>
+            </w:r>
+          </w:p>
+        </w:tc>
+        <w:tc>
+          <w:tcPr>
+            <w:tcW w:type="dxa" w:w="8107"/>
+            <w:tcMar>
+              <w:top w:w="25" w:type="dxa"/>
+              <w:start w:w="90" w:type="dxa"/>
+              <w:bottom w:w="15" w:type="dxa"/>
+              <w:end w:w="0" w:type="dxa"/>
+            </w:tcMar>
+          </w:tcPr>
+          <w:p>
+            <w:pPr>
+              <w:widowControl/>
+              <w:spacing w:after="16"/>
+            </w:pPr>
+            <w:r>
+              <w:t>Python; R; JavaScript; SQL fundamentals.</w:t>
+            </w:r>
+          </w:p>
+        </w:tc>
+      </w:tr>
+    </w:tbl>
+    <w:tbl>
+      <w:tblPr>
+        <w:tblW w:type="auto" w:w="0"/>
+        <w:jc w:val="center"/>
+        <w:tblLayout w:type="fixed"/>
+        <w:tblLook w:firstColumn="1" w:firstRow="1" w:lastColumn="0" w:lastRow="0" w:noHBand="0" w:noVBand="1" w:val="04A0"/>
+        <w:tblBorders>
+          <w:top w:val="nil"/>
+          <w:left w:val="nil"/>
+          <w:bottom w:val="nil"/>
+          <w:right w:val="nil"/>
+          <w:insideH w:val="nil"/>
+          <w:insideV w:val="nil"/>
+        </w:tblBorders>
+      </w:tblPr>
+      <w:tblGrid>
+        <w:gridCol w:w="1899"/>
+        <w:gridCol w:w="8107"/>
+      </w:tblGrid>
+      <w:tr>
+        <w:trPr>
+          <w:cantSplit/>
+        </w:trPr>
+        <w:tc>
+          <w:tcPr>
+            <w:tcW w:type="dxa" w:w="1899"/>
+            <w:tcMar>
+              <w:top w:w="25" w:type="dxa"/>
+              <w:start w:w="0" w:type="dxa"/>
+              <w:bottom w:w="15" w:type="dxa"/>
+              <w:end w:w="160" w:type="dxa"/>
+            </w:tcMar>
+          </w:tcPr>
+          <w:p>
+            <w:pPr>
+              <w:pStyle w:val="CVMeta"/>
+              <w:widowControl/>
+              <w:jc w:val="right"/>
+            </w:pPr>
+            <w:r>
+              <w:rPr>
+                <w:b/>
+                <w:color w:val="1F4E79"/>
+              </w:rPr>
+              <w:t>Machine learning</w:t>
+            </w:r>
+          </w:p>
+        </w:tc>
+        <w:tc>
+          <w:tcPr>
+            <w:tcW w:type="dxa" w:w="8107"/>
+            <w:tcMar>
+              <w:top w:w="25" w:type="dxa"/>
+              <w:start w:w="90" w:type="dxa"/>
+              <w:bottom w:w="15" w:type="dxa"/>
+              <w:end w:w="0" w:type="dxa"/>
+            </w:tcMar>
+          </w:tcPr>
+          <w:p>
+            <w:pPr>
+              <w:widowControl/>
+              <w:spacing w:after="16"/>
+            </w:pPr>
+            <w:r>
+              <w:t>PyTorch; PyTorch Lightning; scikit-learn; adversarial evaluation; model training, validation, threshold analysis, ablation studies, and debugging.</w:t>
+            </w:r>
+          </w:p>
+        </w:tc>
+      </w:tr>
+    </w:tbl>
+    <w:tbl>
+      <w:tblPr>
+        <w:tblW w:type="auto" w:w="0"/>
+        <w:jc w:val="center"/>
+        <w:tblLayout w:type="fixed"/>
+        <w:tblLook w:firstColumn="1" w:firstRow="1" w:lastColumn="0" w:lastRow="0" w:noHBand="0" w:noVBand="1" w:val="04A0"/>
+        <w:tblBorders>
+          <w:top w:val="nil"/>
+          <w:left w:val="nil"/>
+          <w:bottom w:val="nil"/>
+          <w:right w:val="nil"/>
+          <w:insideH w:val="nil"/>
+          <w:insideV w:val="nil"/>
+        </w:tblBorders>
+      </w:tblPr>
+      <w:tblGrid>
+        <w:gridCol w:w="1899"/>
+        <w:gridCol w:w="8107"/>
+      </w:tblGrid>
+      <w:tr>
+        <w:trPr>
+          <w:cantSplit/>
+        </w:trPr>
+        <w:tc>
+          <w:tcPr>
+            <w:tcW w:type="dxa" w:w="1899"/>
+            <w:tcMar>
+              <w:top w:w="25" w:type="dxa"/>
+              <w:start w:w="0" w:type="dxa"/>
+              <w:bottom w:w="15" w:type="dxa"/>
+              <w:end w:w="160" w:type="dxa"/>
+            </w:tcMar>
+          </w:tcPr>
+          <w:p>
+            <w:pPr>
+              <w:pStyle w:val="CVMeta"/>
+              <w:widowControl/>
+              <w:jc w:val="right"/>
+            </w:pPr>
+            <w:r>
+              <w:rPr>
+                <w:b/>
+                <w:color w:val="1F4E79"/>
+              </w:rPr>
+              <w:t>Graphs and networks</w:t>
+            </w:r>
+          </w:p>
+        </w:tc>
+        <w:tc>
+          <w:tcPr>
+            <w:tcW w:type="dxa" w:w="8107"/>
+            <w:tcMar>
+              <w:top w:w="25" w:type="dxa"/>
+              <w:start w:w="90" w:type="dxa"/>
+              <w:bottom w:w="15" w:type="dxa"/>
+              <w:end w:w="0" w:type="dxa"/>
+            </w:tcMar>
+          </w:tcPr>
+          <w:p>
+            <w:pPr>
+              <w:widowControl/>
+              <w:spacing w:after="16"/>
+            </w:pPr>
+            <w:r>
+              <w:t>PyTorch Geometric; NetworkX; Gephi; graph embeddings; graph neural networks; link prediction; network analysis.</w:t>
+            </w:r>
+          </w:p>
+        </w:tc>
+      </w:tr>
+    </w:tbl>
+    <w:tbl>
+      <w:tblPr>
+        <w:tblW w:type="auto" w:w="0"/>
+        <w:jc w:val="center"/>
+        <w:tblLayout w:type="fixed"/>
+        <w:tblLook w:firstColumn="1" w:firstRow="1" w:lastColumn="0" w:lastRow="0" w:noHBand="0" w:noVBand="1" w:val="04A0"/>
+        <w:tblBorders>
+          <w:top w:val="nil"/>
+          <w:left w:val="nil"/>
+          <w:bottom w:val="nil"/>
+          <w:right w:val="nil"/>
+          <w:insideH w:val="nil"/>
+          <w:insideV w:val="nil"/>
+        </w:tblBorders>
+      </w:tblPr>
+      <w:tblGrid>
+        <w:gridCol w:w="1899"/>
+        <w:gridCol w:w="8107"/>
+      </w:tblGrid>
+      <w:tr>
+        <w:trPr>
+          <w:cantSplit/>
+        </w:trPr>
+        <w:tc>
+          <w:tcPr>
+            <w:tcW w:type="dxa" w:w="1899"/>
+            <w:tcMar>
+              <w:top w:w="25" w:type="dxa"/>
+              <w:start w:w="0" w:type="dxa"/>
+              <w:bottom w:w="15" w:type="dxa"/>
+              <w:end w:w="160" w:type="dxa"/>
+            </w:tcMar>
+          </w:tcPr>
+          <w:p>
+            <w:pPr>
+              <w:pStyle w:val="CVMeta"/>
+              <w:widowControl/>
+              <w:jc w:val="right"/>
+            </w:pPr>
+            <w:r>
+              <w:rPr>
+                <w:b/>
+                <w:color w:val="1F4E79"/>
+              </w:rPr>
+              <w:t>Scientific computing</w:t>
+            </w:r>
+          </w:p>
+        </w:tc>
+        <w:tc>
+          <w:tcPr>
+            <w:tcW w:type="dxa" w:w="8107"/>
+            <w:tcMar>
+              <w:top w:w="25" w:type="dxa"/>
+              <w:start w:w="90" w:type="dxa"/>
+              <w:bottom w:w="15" w:type="dxa"/>
+              <w:end w:w="0" w:type="dxa"/>
+            </w:tcMar>
+          </w:tcPr>
+          <w:p>
+            <w:pPr>
+              <w:widowControl/>
+              <w:spacing w:after="16"/>
+            </w:pPr>
+            <w:r>
+              <w:t>NumPy; pandas; Matplotlib; data cleaning; feature engineering; statistical analysis; reproducible notebooks.</w:t>
+            </w:r>
+          </w:p>
+        </w:tc>
+      </w:tr>
+    </w:tbl>
+    <w:tbl>
+      <w:tblPr>
+        <w:tblW w:type="auto" w:w="0"/>
+        <w:jc w:val="center"/>
+        <w:tblLayout w:type="fixed"/>
+        <w:tblLook w:firstColumn="1" w:firstRow="1" w:lastColumn="0" w:lastRow="0" w:noHBand="0" w:noVBand="1" w:val="04A0"/>
+        <w:tblBorders>
+          <w:top w:val="nil"/>
+          <w:left w:val="nil"/>
+          <w:bottom w:val="nil"/>
+          <w:right w:val="nil"/>
+          <w:insideH w:val="nil"/>
+          <w:insideV w:val="nil"/>
+        </w:tblBorders>
+      </w:tblPr>
+      <w:tblGrid>
+        <w:gridCol w:w="1899"/>
+        <w:gridCol w:w="8107"/>
+      </w:tblGrid>
+      <w:tr>
+        <w:trPr>
+          <w:cantSplit/>
+        </w:trPr>
+        <w:tc>
+          <w:tcPr>
+            <w:tcW w:type="dxa" w:w="1899"/>
+            <w:tcMar>
+              <w:top w:w="25" w:type="dxa"/>
+              <w:start w:w="0" w:type="dxa"/>
+              <w:bottom w:w="15" w:type="dxa"/>
+              <w:end w:w="160" w:type="dxa"/>
+            </w:tcMar>
+          </w:tcPr>
+          <w:p>
+            <w:pPr>
+              <w:pStyle w:val="CVMeta"/>
+              <w:widowControl/>
+              <w:jc w:val="right"/>
+            </w:pPr>
+            <w:r>
+              <w:rPr>
+                <w:b/>
+                <w:color w:val="1F4E79"/>
+              </w:rPr>
+              <w:t>Computer vision</w:t>
+            </w:r>
+          </w:p>
+        </w:tc>
+        <w:tc>
+          <w:tcPr>
+            <w:tcW w:type="dxa" w:w="8107"/>
+            <w:tcMar>
+              <w:top w:w="25" w:type="dxa"/>
+              <w:start w:w="90" w:type="dxa"/>
+              <w:bottom w:w="15" w:type="dxa"/>
+              <w:end w:w="0" w:type="dxa"/>
+            </w:tcMar>
+          </w:tcPr>
+          <w:p>
+            <w:pPr>
+              <w:widowControl/>
+              <w:spacing w:after="16"/>
+            </w:pPr>
+            <w:r>
+              <w:t>OpenCV; torchvision; Pillow; autoencoders and VAEs; anomaly maps; segmentation post-processing; localization.</w:t>
+            </w:r>
+          </w:p>
+        </w:tc>
+      </w:tr>
+    </w:tbl>
+    <w:tbl>
+      <w:tblPr>
+        <w:tblW w:type="auto" w:w="0"/>
+        <w:jc w:val="center"/>
+        <w:tblLayout w:type="fixed"/>
+        <w:tblLook w:firstColumn="1" w:firstRow="1" w:lastColumn="0" w:lastRow="0" w:noHBand="0" w:noVBand="1" w:val="04A0"/>
+        <w:tblBorders>
+          <w:top w:val="nil"/>
+          <w:left w:val="nil"/>
+          <w:bottom w:val="nil"/>
+          <w:right w:val="nil"/>
+          <w:insideH w:val="nil"/>
+          <w:insideV w:val="nil"/>
+        </w:tblBorders>
+      </w:tblPr>
+      <w:tblGrid>
+        <w:gridCol w:w="1899"/>
+        <w:gridCol w:w="8107"/>
+      </w:tblGrid>
+      <w:tr>
+        <w:trPr>
+          <w:cantSplit/>
+        </w:trPr>
+        <w:tc>
+          <w:tcPr>
+            <w:tcW w:type="dxa" w:w="1899"/>
+            <w:tcMar>
+              <w:top w:w="25" w:type="dxa"/>
+              <w:start w:w="0" w:type="dxa"/>
+              <w:bottom w:w="15" w:type="dxa"/>
+              <w:end w:w="160" w:type="dxa"/>
+            </w:tcMar>
+          </w:tcPr>
+          <w:p>
+            <w:pPr>
+              <w:pStyle w:val="CVMeta"/>
+              <w:widowControl/>
+              <w:jc w:val="right"/>
+            </w:pPr>
+            <w:r>
+              <w:rPr>
+                <w:b/>
+                <w:color w:val="1F4E79"/>
+              </w:rPr>
+              <w:t>Speech and audio</w:t>
+            </w:r>
+          </w:p>
+        </w:tc>
+        <w:tc>
+          <w:tcPr>
+            <w:tcW w:type="dxa" w:w="8107"/>
+            <w:tcMar>
+              <w:top w:w="25" w:type="dxa"/>
+              <w:start w:w="90" w:type="dxa"/>
+              <w:bottom w:w="15" w:type="dxa"/>
+              <w:end w:w="0" w:type="dxa"/>
+            </w:tcMar>
+          </w:tcPr>
+          <w:p>
+            <w:pPr>
+              <w:widowControl/>
+              <w:spacing w:after="16"/>
+            </w:pPr>
+            <w:r>
+              <w:t>Whisper; LibriSpeech; adversarial audio; WER/CER evaluation; constrained perturbation generation.</w:t>
+            </w:r>
+          </w:p>
+        </w:tc>
+      </w:tr>
+    </w:tbl>
+    <w:tbl>
+      <w:tblPr>
+        <w:tblW w:type="auto" w:w="0"/>
+        <w:jc w:val="center"/>
+        <w:tblLayout w:type="fixed"/>
+        <w:tblLook w:firstColumn="1" w:firstRow="1" w:lastColumn="0" w:lastRow="0" w:noHBand="0" w:noVBand="1" w:val="04A0"/>
+        <w:tblBorders>
+          <w:top w:val="nil"/>
+          <w:left w:val="nil"/>
+          <w:bottom w:val="nil"/>
+          <w:right w:val="nil"/>
+          <w:insideH w:val="nil"/>
+          <w:insideV w:val="nil"/>
+        </w:tblBorders>
+      </w:tblPr>
+      <w:tblGrid>
+        <w:gridCol w:w="1899"/>
+        <w:gridCol w:w="8107"/>
+      </w:tblGrid>
+      <w:tr>
+        <w:trPr>
+          <w:cantSplit/>
+        </w:trPr>
+        <w:tc>
+          <w:tcPr>
+            <w:tcW w:type="dxa" w:w="1899"/>
+            <w:tcMar>
+              <w:top w:w="25" w:type="dxa"/>
+              <w:start w:w="0" w:type="dxa"/>
+              <w:bottom w:w="15" w:type="dxa"/>
+              <w:end w:w="160" w:type="dxa"/>
+            </w:tcMar>
+          </w:tcPr>
+          <w:p>
+            <w:pPr>
+              <w:pStyle w:val="CVMeta"/>
+              <w:widowControl/>
+              <w:jc w:val="right"/>
+            </w:pPr>
+            <w:r>
+              <w:rPr>
+                <w:b/>
+                <w:color w:val="1F4E79"/>
+              </w:rPr>
+              <w:t>Bioinformatics</w:t>
+            </w:r>
+          </w:p>
+        </w:tc>
+        <w:tc>
+          <w:tcPr>
+            <w:tcW w:type="dxa" w:w="8107"/>
+            <w:tcMar>
+              <w:top w:w="25" w:type="dxa"/>
+              <w:start w:w="90" w:type="dxa"/>
+              <w:bottom w:w="15" w:type="dxa"/>
+              <w:end w:w="0" w:type="dxa"/>
+            </w:tcMar>
+          </w:tcPr>
+          <w:p>
+            <w:pPr>
+              <w:widowControl/>
+              <w:spacing w:after="16"/>
+            </w:pPr>
+            <w:r>
+              <w:t>STRING; ProtT5 embeddings; Enrichr; WGCNA; SWIMmeR; SaveRunner; interactome and enrichment workflows.</w:t>
+            </w:r>
+          </w:p>
+        </w:tc>
+      </w:tr>
+    </w:tbl>
+    <w:tbl>
+      <w:tblPr>
+        <w:tblW w:type="auto" w:w="0"/>
+        <w:jc w:val="center"/>
+        <w:tblLayout w:type="fixed"/>
+        <w:tblLook w:firstColumn="1" w:firstRow="1" w:lastColumn="0" w:lastRow="0" w:noHBand="0" w:noVBand="1" w:val="04A0"/>
+        <w:tblBorders>
+          <w:top w:val="nil"/>
+          <w:left w:val="nil"/>
+          <w:bottom w:val="nil"/>
+          <w:right w:val="nil"/>
+          <w:insideH w:val="nil"/>
+          <w:insideV w:val="nil"/>
+        </w:tblBorders>
+      </w:tblPr>
+      <w:tblGrid>
+        <w:gridCol w:w="1899"/>
+        <w:gridCol w:w="8107"/>
+      </w:tblGrid>
+      <w:tr>
+        <w:trPr>
+          <w:cantSplit/>
+        </w:trPr>
+        <w:tc>
+          <w:tcPr>
+            <w:tcW w:type="dxa" w:w="1899"/>
+            <w:tcMar>
+              <w:top w:w="25" w:type="dxa"/>
+              <w:start w:w="0" w:type="dxa"/>
+              <w:bottom w:w="15" w:type="dxa"/>
+              <w:end w:w="160" w:type="dxa"/>
+            </w:tcMar>
+          </w:tcPr>
+          <w:p>
+            <w:pPr>
+              <w:pStyle w:val="CVMeta"/>
+              <w:widowControl/>
+              <w:jc w:val="right"/>
+            </w:pPr>
+            <w:r>
+              <w:rPr>
+                <w:b/>
+                <w:color w:val="1F4E79"/>
+              </w:rPr>
+              <w:t>Software engineering</w:t>
+            </w:r>
+          </w:p>
+        </w:tc>
+        <w:tc>
+          <w:tcPr>
+            <w:tcW w:type="dxa" w:w="8107"/>
+            <w:tcMar>
+              <w:top w:w="25" w:type="dxa"/>
+              <w:start w:w="90" w:type="dxa"/>
+              <w:bottom w:w="15" w:type="dxa"/>
+              <w:end w:w="0" w:type="dxa"/>
+            </w:tcMar>
+          </w:tcPr>
+          <w:p>
+            <w:pPr>
+              <w:widowControl/>
+              <w:spacing w:after="16"/>
+            </w:pPr>
+            <w:r>
+              <w:t>Git; Docker; modular Python; logging and experiment tracking; artifact management; REST APIs; OpenAPI.</w:t>
+            </w:r>
+          </w:p>
+        </w:tc>
+      </w:tr>
+    </w:tbl>
+    <w:tbl>
+      <w:tblPr>
+        <w:tblW w:type="auto" w:w="0"/>
+        <w:jc w:val="center"/>
+        <w:tblLayout w:type="fixed"/>
+        <w:tblLook w:firstColumn="1" w:firstRow="1" w:lastColumn="0" w:lastRow="0" w:noHBand="0" w:noVBand="1" w:val="04A0"/>
+        <w:tblBorders>
+          <w:top w:val="nil"/>
+          <w:left w:val="nil"/>
+          <w:bottom w:val="nil"/>
+          <w:right w:val="nil"/>
+          <w:insideH w:val="nil"/>
+          <w:insideV w:val="nil"/>
+        </w:tblBorders>
+      </w:tblPr>
+      <w:tblGrid>
+        <w:gridCol w:w="1899"/>
+        <w:gridCol w:w="8107"/>
+      </w:tblGrid>
+      <w:tr>
+        <w:trPr>
+          <w:cantSplit/>
+        </w:trPr>
+        <w:tc>
+          <w:tcPr>
+            <w:tcW w:type="dxa" w:w="1899"/>
+            <w:tcMar>
+              <w:top w:w="25" w:type="dxa"/>
+              <w:start w:w="0" w:type="dxa"/>
+              <w:bottom w:w="15" w:type="dxa"/>
+              <w:end w:w="160" w:type="dxa"/>
+            </w:tcMar>
+          </w:tcPr>
+          <w:p>
+            <w:pPr>
+              <w:pStyle w:val="CVMeta"/>
+              <w:widowControl/>
+              <w:jc w:val="right"/>
+            </w:pPr>
+            <w:r>
+              <w:rPr>
+                <w:b/>
+                <w:color w:val="1F4E79"/>
+              </w:rPr>
+              <w:t>Synthetic data</w:t>
+            </w:r>
+          </w:p>
+        </w:tc>
+        <w:tc>
+          <w:tcPr>
+            <w:tcW w:type="dxa" w:w="8107"/>
+            <w:tcMar>
+              <w:top w:w="25" w:type="dxa"/>
+              <w:start w:w="90" w:type="dxa"/>
+              <w:bottom w:w="15" w:type="dxa"/>
+              <w:end w:w="0" w:type="dxa"/>
+            </w:tcMar>
+          </w:tcPr>
+          <w:p>
+            <w:pPr>
+              <w:widowControl/>
+              <w:spacing w:after="16"/>
+            </w:pPr>
+            <w:r>
+              <w:t>Blender; domain randomization; annotation generation; controlled dataset design.</w:t>
+            </w:r>
+          </w:p>
+        </w:tc>
+      </w:tr>
+    </w:tbl>
+    <w:p>
+      <w:pPr>
+        <w:pStyle w:val="CVSection"/>
+        <w:keepNext/>
+        <w:pBdr>
+          <w:bottom w:val="single" w:sz="8" w:space="1" w:color="1F4E79"/>
+        </w:pBdr>
+      </w:pPr>
+      <w:r>
+        <w:t>RESEARCH INTERESTS</w:t>
       </w:r>
     </w:p>
     <w:p>
       <w:pPr>
-        <w:spacing w:before="0" w:after="180" w:line="240" w:lineRule="auto"/>
-        <w:jc w:val="left"/>
+        <w:spacing w:after="16"/>
+        <w:ind w:left="2098" w:hanging="113"/>
       </w:pPr>
       <w:r>
         <w:rPr>
-          <w:rFonts w:ascii="Arial" w:hAnsi="Arial" w:cs="Arial"/>
-          <w:color w:val="5B4F3D"/>
-          <w:sz w:val="18"/>
+          <w:color w:val="1F4E79"/>
         </w:rPr>
-        <w:t xml:space="preserve">Italy  |  </w:t>
+        <w:t xml:space="preserve">• </w:t>
       </w:r>
-      <w:hyperlink r:id="rId11">
-        <w:r>
-          <w:rPr>
-            <w:rFonts w:ascii="Arial" w:hAnsi="Arial"/>
-            <w:color w:val="005A56"/>
-            <w:sz w:val="18"/>
-          </w:rPr>
-          <w:t>lorenzo03.marinelli@gmail.com</w:t>
-        </w:r>
-      </w:hyperlink>
       <w:r>
-        <w:rPr>
-          <w:rFonts w:ascii="Arial" w:hAnsi="Arial" w:cs="Arial"/>
-          <w:color w:val="5B4F3D"/>
-          <w:sz w:val="18"/>
-        </w:rPr>
-        <w:t xml:space="preserve">  |  </w:t>
-      </w:r>
-      <w:hyperlink r:id="rId12">
-        <w:r>
-          <w:rPr>
-            <w:rFonts w:ascii="Arial" w:hAnsi="Arial"/>
-            <w:color w:val="005A56"/>
-            <w:sz w:val="18"/>
-          </w:rPr>
-          <w:t>Portfolio</w:t>
-        </w:r>
-      </w:hyperlink>
-      <w:r>
-        <w:rPr>
-          <w:rFonts w:ascii="Arial" w:hAnsi="Arial" w:cs="Arial"/>
-          <w:color w:val="5B4F3D"/>
-          <w:sz w:val="18"/>
-        </w:rPr>
-        <w:t xml:space="preserve">  |  </w:t>
-      </w:r>
-      <w:hyperlink r:id="rId13">
-        <w:r>
-          <w:rPr>
-            <w:rFonts w:ascii="Arial" w:hAnsi="Arial"/>
-            <w:color w:val="005A56"/>
-            <w:sz w:val="18"/>
-          </w:rPr>
-          <w:t>GitHub</w:t>
-        </w:r>
-      </w:hyperlink>
-      <w:r>
-        <w:rPr>
-          <w:rFonts w:ascii="Arial" w:hAnsi="Arial" w:cs="Arial"/>
-          <w:color w:val="5B4F3D"/>
-          <w:sz w:val="18"/>
-        </w:rPr>
-        <w:t xml:space="preserve">  |  </w:t>
-      </w:r>
-      <w:hyperlink r:id="rId14">
-        <w:r>
-          <w:rPr>
-            <w:rFonts w:ascii="Arial" w:hAnsi="Arial"/>
-            <w:color w:val="005A56"/>
-            <w:sz w:val="18"/>
-          </w:rPr>
-          <w:t>LinkedIn</w:t>
-        </w:r>
-      </w:hyperlink>
-    </w:p>
-    <w:p>
-      <w:pPr>
-        <w:spacing w:before="0" w:after="40" w:line="240" w:lineRule="auto"/>
-      </w:pPr>
-      <w:r>
-        <w:rPr>
-          <w:rFonts w:ascii="Arial" w:hAnsi="Arial" w:cs="Arial"/>
-          <w:b/>
-          <w:color w:val="C10030"/>
-          <w:sz w:val="16"/>
-        </w:rPr>
-        <w:t>PROFILE</w:t>
+        <w:t>Adversarial machine learning and machine-learning security, including adversarial examples, attack and defence evaluation, threat modelling, and realistic robustness benchmarks.</w:t>
       </w:r>
     </w:p>
     <w:p>
       <w:pPr>
-        <w:keepLines/>
-        <w:spacing w:before="0" w:after="160" w:line="278" w:lineRule="auto"/>
-        <w:ind w:left="230" w:right="144"/>
-        <w:shd w:fill="FBF6DE"/>
-        <w:pBdr>
-          <w:left w:val="single" w:sz="18" w:space="8" w:color="C10030"/>
-        </w:pBdr>
+        <w:spacing w:after="16"/>
+        <w:ind w:left="2098" w:hanging="113"/>
       </w:pPr>
       <w:r>
         <w:rPr>
-          <w:rFonts w:ascii="Arial" w:hAnsi="Arial" w:cs="Arial"/>
-          <w:color w:val="1B1710"/>
-          <w:sz w:val="19"/>
+          <w:color w:val="1F4E79"/>
         </w:rPr>
-        <w:t>Computer Science MSc student at Sapienza University of Rome working across applied AI, scientific data, and research-oriented software. I build reproducible experiments and interactive technical tools spanning graph machine learning, bioinformatics, computer vision, time series, reinforcement learning, and language-model-guided workflows.</w:t>
+        <w:t xml:space="preserve">• </w:t>
+      </w:r>
+      <w:r>
+        <w:t>Model robustness and reliability under distribution shift, noisy or imbalanced data, calibration error, and uncertainty.</w:t>
       </w:r>
     </w:p>
     <w:p>
       <w:pPr>
-        <w:pStyle w:val="Heading1"/>
+        <w:spacing w:after="16"/>
+        <w:ind w:left="2098" w:hanging="113"/>
       </w:pPr>
       <w:r>
-        <w:t>Education</w:t>
+        <w:rPr>
+          <w:color w:val="1F4E79"/>
+        </w:rPr>
+        <w:t xml:space="preserve">• </w:t>
+      </w:r>
+      <w:r>
+        <w:t>Graph representation learning for biological networks, link prediction, and heterogeneous data integration.</w:t>
       </w:r>
     </w:p>
     <w:p>
       <w:pPr>
-        <w:pStyle w:val="CVEntry"/>
-        <w:tabs>
-          <w:tab w:pos="9360" w:val="right"/>
-        </w:tabs>
+        <w:spacing w:after="16"/>
+        <w:ind w:left="2098" w:hanging="113"/>
       </w:pPr>
       <w:r>
         <w:rPr>
-          <w:rFonts w:ascii="Arial" w:hAnsi="Arial" w:cs="Arial"/>
-          <w:b/>
-          <w:color w:val="005A56"/>
-          <w:sz w:val="19"/>
+          <w:color w:val="1F4E79"/>
         </w:rPr>
-        <w:t>MSc Computer Science</w:t>
+        <w:t xml:space="preserve">• </w:t>
       </w:r>
       <w:r>
-        <w:rPr>
-          <w:rFonts w:ascii="Arial" w:hAnsi="Arial" w:cs="Arial"/>
-          <w:b/>
-          <w:color w:val="5B4F3D"/>
-          <w:sz w:val="17"/>
-        </w:rPr>
-        <w:tab/>
-        <w:t>2025-Present</w:t>
+        <w:t>Computer vision for anomaly detection, localization, synthetic data generation, and reliable perception in autonomous systems.</w:t>
       </w:r>
     </w:p>
     <w:p>
       <w:pPr>
-        <w:pStyle w:val="CVMeta"/>
-      </w:pPr>
-      <w:r>
-        <w:rPr>
-          <w:rFonts w:ascii="Arial" w:hAnsi="Arial" w:cs="Arial"/>
-          <w:i/>
-          <w:color w:val="5B4F3D"/>
-          <w:sz w:val="17"/>
-        </w:rPr>
-        <w:t>Sapienza University of Rome</w:t>
-      </w:r>
-    </w:p>
-    <w:p>
-      <w:pPr>
-        <w:pStyle w:val="CVEntry"/>
-        <w:tabs>
-          <w:tab w:pos="9360" w:val="right"/>
-        </w:tabs>
-      </w:pPr>
-      <w:r>
-        <w:rPr>
-          <w:rFonts w:ascii="Arial" w:hAnsi="Arial" w:cs="Arial"/>
-          <w:b/>
-          <w:color w:val="005A56"/>
-          <w:sz w:val="19"/>
-        </w:rPr>
-        <w:t>Bachelor's Degree in Applied Computer Science &amp; Artificial Intelligence</w:t>
-      </w:r>
-      <w:r>
-        <w:rPr>
-          <w:rFonts w:ascii="Arial" w:hAnsi="Arial" w:cs="Arial"/>
-          <w:b/>
-          <w:color w:val="5B4F3D"/>
-          <w:sz w:val="17"/>
-        </w:rPr>
-        <w:tab/>
-        <w:t>2022-2025</w:t>
-      </w:r>
-    </w:p>
-    <w:p>
-      <w:pPr>
-        <w:pStyle w:val="CVMeta"/>
-      </w:pPr>
-      <w:r>
-        <w:rPr>
-          <w:rFonts w:ascii="Arial" w:hAnsi="Arial" w:cs="Arial"/>
-          <w:i/>
-          <w:color w:val="5B4F3D"/>
-          <w:sz w:val="17"/>
-        </w:rPr>
-        <w:t>Sapienza University of Rome</w:t>
-      </w:r>
-      <w:r>
-        <w:rPr>
-          <w:rFonts w:ascii="Arial" w:hAnsi="Arial" w:cs="Arial"/>
-          <w:b/>
-          <w:color w:val="C10030"/>
-          <w:sz w:val="17"/>
-        </w:rPr>
-        <w:t xml:space="preserve">  |  Final grade: 110 cum laude</w:t>
-      </w:r>
-    </w:p>
-    <w:p>
-      <w:pPr>
-        <w:pStyle w:val="CVEntry"/>
-        <w:tabs>
-          <w:tab w:pos="9360" w:val="right"/>
-        </w:tabs>
-      </w:pPr>
-      <w:r>
-        <w:rPr>
-          <w:rFonts w:ascii="Arial" w:hAnsi="Arial" w:cs="Arial"/>
-          <w:b/>
-          <w:color w:val="005A56"/>
-          <w:sz w:val="19"/>
-        </w:rPr>
-        <w:t>Scientific High School Diploma</w:t>
-      </w:r>
-      <w:r>
-        <w:rPr>
-          <w:rFonts w:ascii="Arial" w:hAnsi="Arial" w:cs="Arial"/>
-          <w:b/>
-          <w:color w:val="5B4F3D"/>
-          <w:sz w:val="17"/>
-        </w:rPr>
-        <w:tab/>
-        <w:t>2017-2022</w:t>
-      </w:r>
-    </w:p>
-    <w:p>
-      <w:pPr>
-        <w:pStyle w:val="CVMeta"/>
-      </w:pPr>
-      <w:r>
-        <w:rPr>
-          <w:rFonts w:ascii="Arial" w:hAnsi="Arial" w:cs="Arial"/>
-          <w:i/>
-          <w:color w:val="5B4F3D"/>
-          <w:sz w:val="17"/>
-        </w:rPr>
-        <w:t>Liceo Scientifico A. Romita</w:t>
-      </w:r>
-      <w:r>
-        <w:rPr>
-          <w:rFonts w:ascii="Arial" w:hAnsi="Arial" w:cs="Arial"/>
-          <w:b/>
-          <w:color w:val="C10030"/>
-          <w:sz w:val="17"/>
-        </w:rPr>
-        <w:t xml:space="preserve">  |  Final grade: 100 e lode</w:t>
-      </w:r>
-    </w:p>
-    <w:p>
-      <w:pPr>
-        <w:pStyle w:val="Heading1"/>
-      </w:pPr>
-      <w:r>
-        <w:t>Technical Profile</w:t>
-      </w:r>
-    </w:p>
-    <w:p>
-      <w:pPr>
-        <w:keepLines/>
-        <w:spacing w:before="0" w:after="54" w:line="259" w:lineRule="auto"/>
-      </w:pPr>
-      <w:r>
-        <w:rPr>
-          <w:rFonts w:ascii="Arial" w:hAnsi="Arial" w:cs="Arial"/>
-          <w:b/>
-          <w:color w:val="005A56"/>
-          <w:sz w:val="18"/>
-        </w:rPr>
-        <w:t xml:space="preserve">Programming &amp; data: </w:t>
-      </w:r>
-      <w:r>
-        <w:rPr>
-          <w:rFonts w:ascii="Arial" w:hAnsi="Arial" w:cs="Arial"/>
-          <w:color w:val="1B1710"/>
-          <w:sz w:val="18"/>
-        </w:rPr>
-        <w:t>Python, NumPy, pandas, Matplotlib, scikit-learn, notebooks, SQL</w:t>
-      </w:r>
-    </w:p>
-    <w:p>
-      <w:pPr>
-        <w:keepLines/>
-        <w:spacing w:before="0" w:after="54" w:line="259" w:lineRule="auto"/>
-      </w:pPr>
-      <w:r>
-        <w:rPr>
-          <w:rFonts w:ascii="Arial" w:hAnsi="Arial" w:cs="Arial"/>
-          <w:b/>
-          <w:color w:val="005A56"/>
-          <w:sz w:val="18"/>
-        </w:rPr>
-        <w:t xml:space="preserve">Deep learning: </w:t>
-      </w:r>
-      <w:r>
-        <w:rPr>
-          <w:rFonts w:ascii="Arial" w:hAnsi="Arial" w:cs="Arial"/>
-          <w:color w:val="1B1710"/>
-          <w:sz w:val="18"/>
-        </w:rPr>
-        <w:t>PyTorch, PyTorch Lightning, PyTorch Geometric, torchvision, model evaluation</w:t>
-      </w:r>
-    </w:p>
-    <w:p>
-      <w:pPr>
-        <w:keepLines/>
-        <w:spacing w:before="0" w:after="54" w:line="259" w:lineRule="auto"/>
-      </w:pPr>
-      <w:r>
-        <w:rPr>
-          <w:rFonts w:ascii="Arial" w:hAnsi="Arial" w:cs="Arial"/>
-          <w:b/>
-          <w:color w:val="005A56"/>
-          <w:sz w:val="18"/>
-        </w:rPr>
-        <w:t xml:space="preserve">Vision &amp; graphs: </w:t>
-      </w:r>
-      <w:r>
-        <w:rPr>
-          <w:rFonts w:ascii="Arial" w:hAnsi="Arial" w:cs="Arial"/>
-          <w:color w:val="1B1710"/>
-          <w:sz w:val="18"/>
-        </w:rPr>
-        <w:t>OpenCV, NetworkX, Gephi, anomaly localization, graph analysis</w:t>
-      </w:r>
-    </w:p>
-    <w:p>
-      <w:pPr>
-        <w:keepLines/>
-        <w:spacing w:before="0" w:after="54" w:line="259" w:lineRule="auto"/>
-      </w:pPr>
-      <w:r>
-        <w:rPr>
-          <w:rFonts w:ascii="Arial" w:hAnsi="Arial" w:cs="Arial"/>
-          <w:b/>
-          <w:color w:val="005A56"/>
-          <w:sz w:val="18"/>
-        </w:rPr>
-        <w:t xml:space="preserve">Engineering: </w:t>
-      </w:r>
-      <w:r>
-        <w:rPr>
-          <w:rFonts w:ascii="Arial" w:hAnsi="Arial" w:cs="Arial"/>
-          <w:color w:val="1B1710"/>
-          <w:sz w:val="18"/>
-        </w:rPr>
-        <w:t>Git, Docker, HTML/CSS, JavaScript, OpenAPI, lightweight web/API development</w:t>
-      </w:r>
-    </w:p>
-    <w:p>
-      <w:pPr>
-        <w:keepLines/>
-        <w:spacing w:before="0" w:after="54" w:line="259" w:lineRule="auto"/>
-      </w:pPr>
-      <w:r>
-        <w:rPr>
-          <w:rFonts w:ascii="Arial" w:hAnsi="Arial" w:cs="Arial"/>
-          <w:b/>
-          <w:color w:val="005A56"/>
-          <w:sz w:val="18"/>
-        </w:rPr>
-        <w:t xml:space="preserve">Research workflow: </w:t>
-      </w:r>
-      <w:r>
-        <w:rPr>
-          <w:rFonts w:ascii="Arial" w:hAnsi="Arial" w:cs="Arial"/>
-          <w:color w:val="1B1710"/>
-          <w:sz w:val="18"/>
-        </w:rPr>
-        <w:t>Reproducible runs, visual diagnostics, documented experiments, compact demos</w:t>
-      </w:r>
-    </w:p>
-    <w:p>
-      <w:pPr>
-        <w:pStyle w:val="Heading1"/>
-      </w:pPr>
-      <w:r>
-        <w:t>Current Focus &amp; Availability</w:t>
-      </w:r>
-    </w:p>
-    <w:p>
-      <w:pPr>
-        <w:pStyle w:val="ListBullet"/>
-        <w:spacing w:after="36"/>
-      </w:pPr>
-      <w:r>
-        <w:rPr>
-          <w:rFonts w:ascii="Arial" w:hAnsi="Arial" w:cs="Arial"/>
-          <w:color w:val="1B1710"/>
-          <w:sz w:val="18"/>
-        </w:rPr>
-        <w:t>Open to internships, thesis work, research prototypes, and open-source collaboration.</w:t>
-      </w:r>
-    </w:p>
-    <w:p>
-      <w:pPr>
-        <w:pStyle w:val="ListBullet"/>
-        <w:spacing w:after="36"/>
-      </w:pPr>
-      <w:r>
-        <w:rPr>
-          <w:rFonts w:ascii="Arial" w:hAnsi="Arial" w:cs="Arial"/>
-          <w:color w:val="1B1710"/>
-          <w:sz w:val="18"/>
-        </w:rPr>
-        <w:t>Primary interests: deep learning, graph ML, bioinformatics, data analysis, and ML security.</w:t>
-      </w:r>
-    </w:p>
-    <w:p>
-      <w:pPr>
-        <w:pStyle w:val="ListBullet"/>
-        <w:spacing w:after="36"/>
-      </w:pPr>
-      <w:r>
-        <w:rPr>
-          <w:rFonts w:ascii="Arial" w:hAnsi="Arial" w:cs="Arial"/>
-          <w:color w:val="1B1710"/>
-          <w:sz w:val="18"/>
-        </w:rPr>
-        <w:t>Working style: start from the question and data, then choose models and evaluate limitations clearly.</w:t>
-      </w:r>
-    </w:p>
-    <w:p>
-      <w:pPr>
-        <w:spacing w:after="0"/>
-      </w:pPr>
-      <w:r>
-        <w:br w:type="page"/>
-      </w:r>
-    </w:p>
-    <w:p>
-      <w:pPr>
-        <w:pStyle w:val="Heading1"/>
-      </w:pPr>
-      <w:r>
-        <w:t>Selected Project Experience</w:t>
-      </w:r>
-    </w:p>
-    <w:p>
-      <w:pPr>
-        <w:pStyle w:val="Heading2"/>
-      </w:pPr>
-      <w:hyperlink r:id="rId15">
-        <w:r>
-          <w:rPr>
-            <w:rFonts w:ascii="Arial" w:hAnsi="Arial"/>
-            <w:color w:val="005A56"/>
-            <w:sz w:val="21"/>
-            <w:b/>
-          </w:rPr>
-          <w:t>Bachelor's Thesis - GNN Protein Interaction Prediction</w:t>
-        </w:r>
-      </w:hyperlink>
-    </w:p>
-    <w:p>
-      <w:pPr>
-        <w:pStyle w:val="CVMeta"/>
+        <w:pStyle w:val="CVSection"/>
         <w:keepNext/>
-      </w:pPr>
-      <w:r>
-        <w:t>Bioinformatics | Graph ML | Link prediction | ProtT5 embeddings</w:t>
-      </w:r>
-    </w:p>
-    <w:p>
-      <w:pPr>
-        <w:pStyle w:val="ListBullet"/>
-        <w:spacing w:after="36"/>
-      </w:pPr>
-      <w:r>
-        <w:rPr>
-          <w:rFonts w:ascii="Arial" w:hAnsi="Arial" w:cs="Arial"/>
-          <w:color w:val="1B1710"/>
-          <w:sz w:val="18"/>
-        </w:rPr>
-        <w:t>Built a graph-neural-network workflow to rank likely missing protein-protein interactions, combining protein sequence information with known interaction topology and a NOTCH2 case study.</w:t>
-      </w:r>
-    </w:p>
-    <w:p>
-      <w:pPr>
-        <w:pStyle w:val="ListBullet"/>
-        <w:spacing w:after="36"/>
-      </w:pPr>
-      <w:r>
-        <w:rPr>
-          <w:rFonts w:ascii="Arial" w:hAnsi="Arial" w:cs="Arial"/>
-          <w:color w:val="1B1710"/>
-          <w:sz w:val="18"/>
-        </w:rPr>
-        <w:t>Used TAGConv, TransformerConv, and GINConv encoding with a pair decoder; evaluated ranking quality under a 1:10 positive-negative skew.</w:t>
-      </w:r>
-    </w:p>
-    <w:p>
-      <w:pPr>
-        <w:pStyle w:val="ListBullet"/>
-        <w:spacing w:after="36"/>
-      </w:pPr>
-      <w:r>
-        <w:rPr>
-          <w:rFonts w:ascii="Arial" w:hAnsi="Arial" w:cs="Arial"/>
-          <w:color w:val="1B1710"/>
-          <w:sz w:val="18"/>
-        </w:rPr>
-        <w:t>Results: AUROC 0.96, AUPRC 0.89, Precision@500 1.00, about 81% recall at threshold 0.5; documented topology bias and scalability limits.</w:t>
-      </w:r>
-    </w:p>
-    <w:p>
-      <w:pPr>
-        <w:keepLines/>
-        <w:spacing w:before="40" w:after="100" w:line="240" w:lineRule="auto"/>
-        <w:jc w:val="center"/>
-        <w:shd w:fill="E8F3F1"/>
         <w:pBdr>
-          <w:left w:val="single" w:sz="14" w:space="5" w:color="005A56"/>
+          <w:bottom w:val="single" w:sz="8" w:space="1" w:color="1F4E79"/>
         </w:pBdr>
       </w:pPr>
       <w:r>
-        <w:rPr>
-          <w:rFonts w:ascii="Arial" w:hAnsi="Arial" w:cs="Arial"/>
-          <w:b/>
-          <w:color w:val="005A56"/>
-          <w:sz w:val="17"/>
-        </w:rPr>
-        <w:t>THESIS RESULTS   AUROC 0.96   |   AUPRC 0.89   |   P@500 1.00   |   Recall ~81%</w:t>
+        <w:t>LANGUAGE SKILLS AND CERTIFICATION</w:t>
       </w:r>
     </w:p>
+    <w:tbl>
+      <w:tblPr>
+        <w:tblW w:type="auto" w:w="0"/>
+        <w:jc w:val="center"/>
+        <w:tblLayout w:type="fixed"/>
+        <w:tblLook w:firstColumn="1" w:firstRow="1" w:lastColumn="0" w:lastRow="0" w:noHBand="0" w:noVBand="1" w:val="04A0"/>
+        <w:tblBorders>
+          <w:top w:val="nil"/>
+          <w:left w:val="nil"/>
+          <w:bottom w:val="nil"/>
+          <w:right w:val="nil"/>
+          <w:insideH w:val="nil"/>
+          <w:insideV w:val="nil"/>
+        </w:tblBorders>
+      </w:tblPr>
+      <w:tblGrid>
+        <w:gridCol w:w="1899"/>
+        <w:gridCol w:w="8107"/>
+      </w:tblGrid>
+      <w:tr>
+        <w:trPr>
+          <w:cantSplit/>
+        </w:trPr>
+        <w:tc>
+          <w:tcPr>
+            <w:tcW w:type="dxa" w:w="1899"/>
+            <w:tcMar>
+              <w:top w:w="25" w:type="dxa"/>
+              <w:start w:w="0" w:type="dxa"/>
+              <w:bottom w:w="15" w:type="dxa"/>
+              <w:end w:w="160" w:type="dxa"/>
+            </w:tcMar>
+          </w:tcPr>
+          <w:p>
+            <w:pPr>
+              <w:pStyle w:val="CVMeta"/>
+              <w:widowControl/>
+              <w:jc w:val="right"/>
+            </w:pPr>
+            <w:r>
+              <w:rPr>
+                <w:b/>
+                <w:color w:val="1F4E79"/>
+              </w:rPr>
+              <w:t>Mother tongue</w:t>
+            </w:r>
+          </w:p>
+        </w:tc>
+        <w:tc>
+          <w:tcPr>
+            <w:tcW w:type="dxa" w:w="8107"/>
+            <w:tcMar>
+              <w:top w:w="25" w:type="dxa"/>
+              <w:start w:w="90" w:type="dxa"/>
+              <w:bottom w:w="15" w:type="dxa"/>
+              <w:end w:w="0" w:type="dxa"/>
+            </w:tcMar>
+          </w:tcPr>
+          <w:p>
+            <w:pPr>
+              <w:widowControl/>
+              <w:spacing w:after="16"/>
+            </w:pPr>
+            <w:r>
+              <w:t>Italian</w:t>
+            </w:r>
+          </w:p>
+        </w:tc>
+      </w:tr>
+    </w:tbl>
+    <w:tbl>
+      <w:tblPr>
+        <w:tblW w:type="auto" w:w="0"/>
+        <w:jc w:val="center"/>
+        <w:tblLayout w:type="fixed"/>
+        <w:tblLook w:firstColumn="1" w:firstRow="1" w:lastColumn="0" w:lastRow="0" w:noHBand="0" w:noVBand="1" w:val="04A0"/>
+        <w:tblBorders>
+          <w:top w:val="nil"/>
+          <w:left w:val="nil"/>
+          <w:bottom w:val="nil"/>
+          <w:right w:val="nil"/>
+          <w:insideH w:val="nil"/>
+          <w:insideV w:val="nil"/>
+        </w:tblBorders>
+      </w:tblPr>
+      <w:tblGrid>
+        <w:gridCol w:w="1899"/>
+        <w:gridCol w:w="8107"/>
+      </w:tblGrid>
+      <w:tr>
+        <w:trPr>
+          <w:cantSplit/>
+        </w:trPr>
+        <w:tc>
+          <w:tcPr>
+            <w:tcW w:type="dxa" w:w="1899"/>
+            <w:tcMar>
+              <w:top w:w="25" w:type="dxa"/>
+              <w:start w:w="0" w:type="dxa"/>
+              <w:bottom w:w="15" w:type="dxa"/>
+              <w:end w:w="160" w:type="dxa"/>
+            </w:tcMar>
+          </w:tcPr>
+          <w:p>
+            <w:pPr>
+              <w:pStyle w:val="CVMeta"/>
+              <w:widowControl/>
+              <w:jc w:val="right"/>
+            </w:pPr>
+            <w:r>
+              <w:rPr>
+                <w:b/>
+                <w:color w:val="1F4E79"/>
+              </w:rPr>
+              <w:t>Other language</w:t>
+            </w:r>
+          </w:p>
+        </w:tc>
+        <w:tc>
+          <w:tcPr>
+            <w:tcW w:type="dxa" w:w="8107"/>
+            <w:tcMar>
+              <w:top w:w="25" w:type="dxa"/>
+              <w:start w:w="90" w:type="dxa"/>
+              <w:bottom w:w="15" w:type="dxa"/>
+              <w:end w:w="0" w:type="dxa"/>
+            </w:tcMar>
+          </w:tcPr>
+          <w:p>
+            <w:pPr>
+              <w:widowControl/>
+              <w:spacing w:after="16"/>
+            </w:pPr>
+            <w:r>
+              <w:t>English - C1 (CEFR)</w:t>
+            </w:r>
+          </w:p>
+        </w:tc>
+      </w:tr>
+    </w:tbl>
+    <w:tbl>
+      <w:tblPr>
+        <w:tblW w:type="auto" w:w="0"/>
+        <w:jc w:val="center"/>
+        <w:tblLayout w:type="fixed"/>
+        <w:tblLook w:firstColumn="1" w:firstRow="1" w:lastColumn="0" w:lastRow="0" w:noHBand="0" w:noVBand="1" w:val="04A0"/>
+        <w:tblBorders>
+          <w:top w:val="nil"/>
+          <w:left w:val="nil"/>
+          <w:bottom w:val="nil"/>
+          <w:right w:val="nil"/>
+          <w:insideH w:val="nil"/>
+          <w:insideV w:val="nil"/>
+        </w:tblBorders>
+      </w:tblPr>
+      <w:tblGrid>
+        <w:gridCol w:w="1899"/>
+        <w:gridCol w:w="8107"/>
+      </w:tblGrid>
+      <w:tr>
+        <w:trPr>
+          <w:cantSplit/>
+        </w:trPr>
+        <w:tc>
+          <w:tcPr>
+            <w:tcW w:type="dxa" w:w="1899"/>
+            <w:vAlign w:val="top"/>
+            <w:tcMar>
+              <w:top w:w="40" w:type="dxa"/>
+              <w:start w:w="0" w:type="dxa"/>
+              <w:bottom w:w="20" w:type="dxa"/>
+              <w:end w:w="160" w:type="dxa"/>
+            </w:tcMar>
+          </w:tcPr>
+          <w:p>
+            <w:pPr>
+              <w:pStyle w:val="CVMeta"/>
+              <w:widowControl/>
+              <w:jc w:val="right"/>
+            </w:pPr>
+            <w:r>
+              <w:rPr>
+                <w:b/>
+                <w:color w:val="1F4E79"/>
+              </w:rPr>
+              <w:t>2022</w:t>
+            </w:r>
+          </w:p>
+        </w:tc>
+        <w:tc>
+          <w:tcPr>
+            <w:tcW w:type="dxa" w:w="8107"/>
+            <w:vAlign w:val="top"/>
+            <w:tcMar>
+              <w:top w:w="40" w:type="dxa"/>
+              <w:start w:w="90" w:type="dxa"/>
+              <w:bottom w:w="20" w:type="dxa"/>
+              <w:end w:w="0" w:type="dxa"/>
+            </w:tcMar>
+          </w:tcPr>
+          <w:p>
+            <w:pPr>
+              <w:pStyle w:val="CVItemTitle"/>
+              <w:keepNext/>
+              <w:widowControl/>
+            </w:pPr>
+            <w:r>
+              <w:t>Cambridge English: Advanced (CAE)</w:t>
+            </w:r>
+          </w:p>
+          <w:p>
+            <w:pPr>
+              <w:pStyle w:val="CVMeta"/>
+              <w:keepNext/>
+              <w:widowControl/>
+            </w:pPr>
+            <w:r>
+              <w:t>Cambridge Assessment English</w:t>
+            </w:r>
+          </w:p>
+          <w:p>
+            <w:pPr>
+              <w:widowControl/>
+              <w:spacing w:after="30"/>
+            </w:pPr>
+            <w:r>
+              <w:t>Cambridge English Level 2 Certificate in ESOL International (Advanced), CEFR level C1.</w:t>
+            </w:r>
+          </w:p>
+        </w:tc>
+      </w:tr>
+    </w:tbl>
     <w:p>
       <w:pPr>
-        <w:pStyle w:val="Heading2"/>
-      </w:pPr>
-      <w:hyperlink r:id="rId16">
-        <w:r>
-          <w:rPr>
-            <w:rFonts w:ascii="Arial" w:hAnsi="Arial"/>
-            <w:color w:val="005A56"/>
-            <w:sz w:val="21"/>
-            <w:b/>
-          </w:rPr>
-          <w:t>RL-Nav v1 - Oracle-Guided RL for Partial-Observation Navigation</w:t>
-        </w:r>
-      </w:hyperlink>
-    </w:p>
-    <w:p>
-      <w:pPr>
-        <w:pStyle w:val="CVMeta"/>
+        <w:pStyle w:val="CVSection"/>
         <w:keepNext/>
+        <w:pBdr>
+          <w:bottom w:val="single" w:sz="8" w:space="1" w:color="1F4E79"/>
+        </w:pBdr>
       </w:pPr>
       <w:r>
-        <w:t>Reinforcement learning | LLM guidance | Recurrent control | PyBullet</w:t>
+        <w:t>ADDITIONAL INFORMATION</w:t>
       </w:r>
     </w:p>
-    <w:p>
-      <w:pPr>
-        <w:pStyle w:val="ListBullet"/>
-        <w:spacing w:after="36"/>
-      </w:pPr>
-      <w:r>
-        <w:rPr>
-          <w:rFonts w:ascii="Arial" w:hAnsi="Arial" w:cs="Arial"/>
-          <w:color w:val="1B1710"/>
-          <w:sz w:val="18"/>
-        </w:rPr>
-        <w:t>Designed the interface and constrained structured outputs for an LLM oracle guiding navigation in a stochastic, partially observed environment with a hidden goal.</w:t>
-      </w:r>
-    </w:p>
-    <w:p>
-      <w:pPr>
-        <w:pStyle w:val="ListBullet"/>
-        <w:spacing w:after="36"/>
-      </w:pPr>
-      <w:r>
-        <w:rPr>
-          <w:rFonts w:ascii="Arial" w:hAnsi="Arial" w:cs="Arial"/>
-          <w:color w:val="1B1710"/>
-          <w:sz w:val="18"/>
-        </w:rPr>
-        <w:t>Reached 62% held-out success and identified robust execution as the principal bottleneck.</w:t>
-      </w:r>
-    </w:p>
-    <w:p>
-      <w:pPr>
-        <w:pStyle w:val="Heading2"/>
-      </w:pPr>
-      <w:hyperlink r:id="rId17">
-        <w:r>
-          <w:rPr>
-            <w:rFonts w:ascii="Arial" w:hAnsi="Arial"/>
-            <w:color w:val="005A56"/>
-            <w:sz w:val="21"/>
-            <w:b/>
-          </w:rPr>
-          <w:t>UAV Anomaly Detection &amp; Localization</w:t>
-        </w:r>
-      </w:hyperlink>
-    </w:p>
-    <w:p>
-      <w:pPr>
-        <w:pStyle w:val="CVMeta"/>
-        <w:keepNext/>
-      </w:pPr>
-      <w:r>
-        <w:t>Computer vision | AE/VAE | Heatmaps | Connected components</w:t>
-      </w:r>
-    </w:p>
-    <w:p>
-      <w:pPr>
-        <w:pStyle w:val="ListBullet"/>
-        <w:spacing w:after="36"/>
-      </w:pPr>
-      <w:r>
-        <w:rPr>
-          <w:rFonts w:ascii="Arial" w:hAnsi="Arial" w:cs="Arial"/>
-          <w:color w:val="1B1710"/>
-          <w:sz w:val="18"/>
-        </w:rPr>
-        <w:t>Developed a modular proposal pipeline for high-resolution aerial imagery: reconstruct the expected scene, score residual anomalies, threshold and clean masks, then extract boxes and crops.</w:t>
-      </w:r>
-    </w:p>
-    <w:p>
-      <w:pPr>
-        <w:pStyle w:val="ListBullet"/>
-        <w:spacing w:after="36"/>
-      </w:pPr>
-      <w:r>
-        <w:rPr>
-          <w:rFonts w:ascii="Arial" w:hAnsi="Arial" w:cs="Arial"/>
-          <w:color w:val="1B1710"/>
-          <w:sz w:val="18"/>
-        </w:rPr>
-        <w:t>Focused on interpretable anomaly maps and lightweight candidate generation before downstream classification.</w:t>
-      </w:r>
-    </w:p>
-    <w:p>
-      <w:pPr>
-        <w:pStyle w:val="Heading2"/>
-      </w:pPr>
-      <w:hyperlink r:id="rId18">
-        <w:r>
-          <w:rPr>
-            <w:rFonts w:ascii="Arial" w:hAnsi="Arial"/>
-            <w:color w:val="005A56"/>
-            <w:sz w:val="21"/>
-            <w:b/>
-          </w:rPr>
-          <w:t>Lorenz Attractor Forecasting</w:t>
-        </w:r>
-      </w:hyperlink>
-    </w:p>
-    <w:p>
-      <w:pPr>
-        <w:pStyle w:val="CVMeta"/>
-        <w:keepNext/>
-      </w:pPr>
-      <w:r>
-        <w:t>LSTM | Time series | Chaotic systems | Numerical simulation</w:t>
-      </w:r>
-    </w:p>
-    <w:p>
-      <w:pPr>
-        <w:pStyle w:val="ListBullet"/>
-        <w:spacing w:after="36"/>
-      </w:pPr>
-      <w:r>
-        <w:rPr>
-          <w:rFonts w:ascii="Arial" w:hAnsi="Arial" w:cs="Arial"/>
-          <w:color w:val="1B1710"/>
-          <w:sz w:val="18"/>
-        </w:rPr>
-        <w:t>Compared coordinate, derivative-aware, and residual-style recurrent forecasting approaches on a chaotic dynamical system.</w:t>
-      </w:r>
-    </w:p>
-    <w:p>
-      <w:pPr>
-        <w:pStyle w:val="ListBullet"/>
-        <w:spacing w:after="36"/>
-      </w:pPr>
-      <w:r>
-        <w:rPr>
-          <w:rFonts w:ascii="Arial" w:hAnsi="Arial" w:cs="Arial"/>
-          <w:color w:val="1B1710"/>
-          <w:sz w:val="18"/>
-        </w:rPr>
-        <w:t>Used recursive rollouts to study drift, stability, and error accumulation beyond short-horizon metrics.</w:t>
-      </w:r>
-    </w:p>
-    <w:p>
-      <w:pPr>
-        <w:pStyle w:val="Heading1"/>
-      </w:pPr>
-      <w:r>
-        <w:t>Additional Projects</w:t>
-      </w:r>
-    </w:p>
-    <w:p>
-      <w:pPr>
-        <w:keepLines/>
-        <w:spacing w:before="0" w:after="60" w:line="264" w:lineRule="auto"/>
-      </w:pPr>
-      <w:r>
-        <w:rPr>
-          <w:rFonts w:ascii="Arial" w:hAnsi="Arial" w:cs="Arial"/>
-          <w:b/>
-          <w:color w:val="005A56"/>
-          <w:sz w:val="18"/>
-        </w:rPr>
-        <w:t xml:space="preserve">EU Elections 2019 Data Analysis: </w:t>
-      </w:r>
-      <w:r>
-        <w:rPr>
-          <w:rFonts w:ascii="Arial" w:hAnsi="Arial" w:cs="Arial"/>
-          <w:color w:val="1B1710"/>
-          <w:sz w:val="18"/>
-        </w:rPr>
-        <w:t>Cleaned public data, checked hypotheses, and produced reproducible visual and narrative analysis.</w:t>
-      </w:r>
-    </w:p>
-    <w:p>
-      <w:pPr>
-        <w:keepLines/>
-        <w:spacing w:before="0" w:after="60" w:line="264" w:lineRule="auto"/>
-      </w:pPr>
-      <w:r>
-        <w:rPr>
-          <w:rFonts w:ascii="Arial" w:hAnsi="Arial" w:cs="Arial"/>
-          <w:b/>
-          <w:color w:val="005A56"/>
-          <w:sz w:val="18"/>
-        </w:rPr>
-        <w:t xml:space="preserve">Synthetic Dataset Generation in Blender: </w:t>
-      </w:r>
-      <w:r>
-        <w:rPr>
-          <w:rFonts w:ascii="Arial" w:hAnsi="Arial" w:cs="Arial"/>
-          <w:color w:val="1B1710"/>
-          <w:sz w:val="18"/>
-        </w:rPr>
-        <w:t>Generated labeled, domain-randomized renders for YOLO-style object-detection training.</w:t>
-      </w:r>
-    </w:p>
-    <w:p>
-      <w:pPr>
-        <w:keepLines/>
-        <w:spacing w:before="0" w:after="60" w:line="264" w:lineRule="auto"/>
-      </w:pPr>
-      <w:r>
-        <w:rPr>
-          <w:rFonts w:ascii="Arial" w:hAnsi="Arial" w:cs="Arial"/>
-          <w:b/>
-          <w:color w:val="005A56"/>
-          <w:sz w:val="18"/>
-        </w:rPr>
-        <w:t xml:space="preserve">Small Web / API Projects: </w:t>
-      </w:r>
-      <w:r>
-        <w:rPr>
-          <w:rFonts w:ascii="Arial" w:hAnsi="Arial" w:cs="Arial"/>
-          <w:color w:val="1B1710"/>
-          <w:sz w:val="18"/>
-        </w:rPr>
-        <w:t>Built lightweight apps and API integrations using OpenAPI, SQL, HTML, CSS, and JavaScript; includes WasaText, Mood Tracker, and this portfolio.</w:t>
-      </w:r>
-    </w:p>
-    <w:p>
-      <w:pPr>
-        <w:spacing w:after="0"/>
-      </w:pPr>
-      <w:r>
-        <w:br w:type="page"/>
-      </w:r>
-    </w:p>
-    <w:p>
-      <w:pPr>
-        <w:pStyle w:val="Heading1"/>
-      </w:pPr>
-      <w:r>
-        <w:t>Interactive Technical Portfolio</w:t>
-      </w:r>
-    </w:p>
-    <w:p>
-      <w:pPr>
-        <w:keepLines/>
-        <w:spacing w:before="0" w:after="80" w:line="269" w:lineRule="auto"/>
-      </w:pPr>
-      <w:r>
-        <w:rPr>
-          <w:rFonts w:ascii="Arial" w:hAnsi="Arial" w:cs="Arial"/>
-          <w:color w:val="1B1710"/>
-          <w:sz w:val="19"/>
-        </w:rPr>
-        <w:t>Built fourteen browser-native explainers, simulations, and utilities that turn technical concepts into inspectable interactions.</w:t>
-      </w:r>
-    </w:p>
-    <w:p>
-      <w:pPr>
-        <w:pStyle w:val="ListBullet"/>
-        <w:spacing w:after="60"/>
-      </w:pPr>
-      <w:r>
-        <w:rPr>
-          <w:rFonts w:ascii="Arial" w:hAnsi="Arial" w:cs="Arial"/>
-          <w:b/>
-          <w:color w:val="005A56"/>
-          <w:sz w:val="18"/>
-        </w:rPr>
-        <w:t xml:space="preserve">Graph &amp; machine learning: </w:t>
-      </w:r>
-      <w:r>
-        <w:rPr>
-          <w:rFonts w:ascii="Arial" w:hAnsi="Arial" w:cs="Arial"/>
-          <w:color w:val="1B1710"/>
-          <w:sz w:val="18"/>
-        </w:rPr>
-        <w:t>Graph Signal Diffusion; GNN Message Passing Toy; Clustering Lab; MLP Decision Boundary Lab; Anomaly Node Game</w:t>
-      </w:r>
-    </w:p>
-    <w:p>
-      <w:pPr>
-        <w:pStyle w:val="ListBullet"/>
-        <w:spacing w:after="60"/>
-      </w:pPr>
-      <w:r>
-        <w:rPr>
-          <w:rFonts w:ascii="Arial" w:hAnsi="Arial" w:cs="Arial"/>
-          <w:b/>
-          <w:color w:val="005A56"/>
-          <w:sz w:val="18"/>
-        </w:rPr>
-        <w:t xml:space="preserve">Signals, vision &amp; generative models: </w:t>
-      </w:r>
-      <w:r>
-        <w:rPr>
-          <w:rFonts w:ascii="Arial" w:hAnsi="Arial" w:cs="Arial"/>
-          <w:color w:val="1B1710"/>
-          <w:sz w:val="18"/>
-        </w:rPr>
-        <w:t>Fourier Transform Playground; Signal Filter Playground; Convolution Kernel Playground; Computer Vision Mini Lab; Diffusion Model Denoising Toy</w:t>
-      </w:r>
-    </w:p>
-    <w:p>
-      <w:pPr>
-        <w:pStyle w:val="ListBullet"/>
-        <w:spacing w:after="60"/>
-      </w:pPr>
-      <w:r>
-        <w:rPr>
-          <w:rFonts w:ascii="Arial" w:hAnsi="Arial" w:cs="Arial"/>
-          <w:b/>
-          <w:color w:val="005A56"/>
-          <w:sz w:val="18"/>
-        </w:rPr>
-        <w:t xml:space="preserve">Scientific &amp; creative computing: </w:t>
-      </w:r>
-      <w:r>
-        <w:rPr>
-          <w:rFonts w:ascii="Arial" w:hAnsi="Arial" w:cs="Arial"/>
-          <w:color w:val="1B1710"/>
-          <w:sz w:val="18"/>
-        </w:rPr>
-        <w:t>Gravity Assist Sandbox; Circle of Fifths Network; Image Color Editor</w:t>
-      </w:r>
-    </w:p>
-    <w:p>
-      <w:pPr>
-        <w:pStyle w:val="ListBullet"/>
-        <w:spacing w:after="60"/>
-      </w:pPr>
-      <w:r>
-        <w:rPr>
-          <w:rFonts w:ascii="Arial" w:hAnsi="Arial" w:cs="Arial"/>
-          <w:b/>
-          <w:color w:val="005A56"/>
-          <w:sz w:val="18"/>
-        </w:rPr>
-        <w:t xml:space="preserve">Browser utility: </w:t>
-      </w:r>
-      <w:r>
-        <w:rPr>
-          <w:rFonts w:ascii="Arial" w:hAnsi="Arial" w:cs="Arial"/>
-          <w:color w:val="1B1710"/>
-          <w:sz w:val="18"/>
-        </w:rPr>
-        <w:t>Local File Converter using browser-native tools and FFmpeg.wasm</w:t>
-      </w:r>
-    </w:p>
-    <w:p>
-      <w:pPr>
-        <w:spacing w:before="20" w:after="100" w:line="240" w:lineRule="auto"/>
-      </w:pPr>
-      <w:hyperlink r:id="rId19">
-        <w:r>
-          <w:rPr>
-            <w:rFonts w:ascii="Arial" w:hAnsi="Arial"/>
-            <w:color w:val="005A56"/>
-            <w:sz w:val="18"/>
-            <w:b/>
-          </w:rPr>
-          <w:t>www.lmarinelli.eu/playground/</w:t>
-        </w:r>
-      </w:hyperlink>
-    </w:p>
-    <w:p>
-      <w:pPr>
-        <w:pStyle w:val="Heading1"/>
-      </w:pPr>
-      <w:r>
-        <w:t>Research Practice</w:t>
-      </w:r>
-    </w:p>
-    <w:p>
-      <w:pPr>
-        <w:pStyle w:val="ListBullet"/>
-      </w:pPr>
-      <w:r>
-        <w:rPr>
-          <w:rFonts w:ascii="Arial" w:hAnsi="Arial" w:cs="Arial"/>
-          <w:color w:val="1B1710"/>
-          <w:sz w:val="18"/>
-        </w:rPr>
-        <w:t>Connect coursework, thesis work, and personal projects through readable notes, demos, and practical evaluation.</w:t>
-      </w:r>
-    </w:p>
-    <w:p>
-      <w:pPr>
-        <w:pStyle w:val="ListBullet"/>
-      </w:pPr>
-      <w:r>
-        <w:rPr>
-          <w:rFonts w:ascii="Arial" w:hAnsi="Arial" w:cs="Arial"/>
-          <w:color w:val="1B1710"/>
-          <w:sz w:val="18"/>
-        </w:rPr>
-        <w:t>Turn domain problems and messy datasets into reproducible analyses, visual summaries, and documented experiments.</w:t>
-      </w:r>
-    </w:p>
-    <w:p>
-      <w:pPr>
-        <w:pStyle w:val="ListBullet"/>
-      </w:pPr>
-      <w:r>
-        <w:rPr>
-          <w:rFonts w:ascii="Arial" w:hAnsi="Arial" w:cs="Arial"/>
-          <w:color w:val="1B1710"/>
-          <w:sz w:val="18"/>
-        </w:rPr>
-        <w:t>Maintain a learning log; current reference work includes an NVIDIA DLI course on adversarial machine learning and model security.</w:t>
-      </w:r>
-    </w:p>
-    <w:p>
-      <w:pPr>
-        <w:pStyle w:val="Heading1"/>
-      </w:pPr>
-      <w:r>
-        <w:t>Broader Interests</w:t>
-      </w:r>
-    </w:p>
-    <w:p>
-      <w:pPr>
-        <w:keepLines/>
-        <w:spacing w:before="0" w:after="80" w:line="269" w:lineRule="auto"/>
-      </w:pPr>
-      <w:r>
-        <w:rPr>
-          <w:rFonts w:ascii="Arial" w:hAnsi="Arial" w:cs="Arial"/>
-          <w:color w:val="1B1710"/>
-          <w:sz w:val="19"/>
-        </w:rPr>
-        <w:t>Statistics, psychology, physics, biology, and philosophy; writing music, classical guitar, 3D modeling, drawing, photography, films, television series, and video games.</w:t>
-      </w:r>
-    </w:p>
-    <w:p>
-      <w:pPr>
-        <w:pStyle w:val="Heading1"/>
-      </w:pPr>
-      <w:r>
-        <w:t>Portfolio &amp; Contact</w:t>
-      </w:r>
-    </w:p>
-    <w:p>
-      <w:pPr>
-        <w:keepLines/>
-        <w:spacing w:before="0" w:after="80" w:line="264" w:lineRule="auto"/>
-      </w:pPr>
-      <w:r>
-        <w:rPr>
-          <w:rFonts w:ascii="Arial" w:hAnsi="Arial" w:cs="Arial"/>
-          <w:color w:val="1B1710"/>
-          <w:sz w:val="18"/>
-        </w:rPr>
-        <w:t>Project details, thesis artifacts, presentations, and interactive demos are available online.</w:t>
-      </w:r>
-    </w:p>
-    <w:p>
-      <w:pPr>
-        <w:pStyle w:val="ListBullet"/>
-        <w:spacing w:after="40"/>
-      </w:pPr>
-      <w:hyperlink r:id="rId12">
-        <w:r>
-          <w:rPr>
-            <w:rFonts w:ascii="Arial" w:hAnsi="Arial"/>
-            <w:color w:val="005A56"/>
-            <w:sz w:val="18"/>
-            <w:b/>
-          </w:rPr>
-          <w:t>Portfolio</w:t>
-        </w:r>
-      </w:hyperlink>
-    </w:p>
-    <w:p>
-      <w:pPr>
-        <w:pStyle w:val="ListBullet"/>
-        <w:spacing w:after="40"/>
-      </w:pPr>
-      <w:hyperlink r:id="rId13">
-        <w:r>
-          <w:rPr>
-            <w:rFonts w:ascii="Arial" w:hAnsi="Arial"/>
-            <w:color w:val="005A56"/>
-            <w:sz w:val="18"/>
-            <w:b/>
-          </w:rPr>
-          <w:t>GitHub</w:t>
-        </w:r>
-      </w:hyperlink>
-    </w:p>
-    <w:p>
-      <w:pPr>
-        <w:pStyle w:val="ListBullet"/>
-        <w:spacing w:after="40"/>
-      </w:pPr>
-      <w:hyperlink r:id="rId14">
-        <w:r>
-          <w:rPr>
-            <w:rFonts w:ascii="Arial" w:hAnsi="Arial"/>
-            <w:color w:val="005A56"/>
-            <w:sz w:val="18"/>
-            <w:b/>
-          </w:rPr>
-          <w:t>LinkedIn</w:t>
-        </w:r>
-      </w:hyperlink>
-    </w:p>
-    <w:p>
-      <w:pPr>
-        <w:pStyle w:val="ListBullet"/>
-        <w:spacing w:after="40"/>
-      </w:pPr>
-      <w:hyperlink r:id="rId20">
-        <w:r>
-          <w:rPr>
-            <w:rFonts w:ascii="Arial" w:hAnsi="Arial"/>
-            <w:color w:val="005A56"/>
-            <w:sz w:val="18"/>
-            <w:b/>
-          </w:rPr>
-          <w:t>Bachelor's thesis PDF</w:t>
-        </w:r>
-      </w:hyperlink>
-    </w:p>
-    <w:p>
-      <w:pPr>
-        <w:pStyle w:val="ListBullet"/>
-        <w:spacing w:after="40"/>
-      </w:pPr>
-      <w:hyperlink r:id="rId21">
-        <w:r>
-          <w:rPr>
-            <w:rFonts w:ascii="Arial" w:hAnsi="Arial"/>
-            <w:color w:val="005A56"/>
-            <w:sz w:val="18"/>
-            <w:b/>
-          </w:rPr>
-          <w:t>Thesis slides</w:t>
-        </w:r>
-      </w:hyperlink>
-    </w:p>
-    <w:p>
-      <w:pPr>
-        <w:pStyle w:val="ListBullet"/>
-        <w:spacing w:after="40"/>
-      </w:pPr>
-      <w:hyperlink r:id="rId16">
-        <w:r>
-          <w:rPr>
-            <w:rFonts w:ascii="Arial" w:hAnsi="Arial"/>
-            <w:color w:val="005A56"/>
-            <w:sz w:val="18"/>
-            <w:b/>
-          </w:rPr>
-          <w:t>RL-Nav presentation</w:t>
-        </w:r>
-      </w:hyperlink>
-    </w:p>
+    <w:tbl>
+      <w:tblPr>
+        <w:tblW w:type="auto" w:w="0"/>
+        <w:jc w:val="center"/>
+        <w:tblLayout w:type="fixed"/>
+        <w:tblLook w:firstColumn="1" w:firstRow="1" w:lastColumn="0" w:lastRow="0" w:noHBand="0" w:noVBand="1" w:val="04A0"/>
+        <w:tblBorders>
+          <w:top w:val="nil"/>
+          <w:left w:val="nil"/>
+          <w:bottom w:val="nil"/>
+          <w:right w:val="nil"/>
+          <w:insideH w:val="nil"/>
+          <w:insideV w:val="nil"/>
+        </w:tblBorders>
+      </w:tblPr>
+      <w:tblGrid>
+        <w:gridCol w:w="1899"/>
+        <w:gridCol w:w="8107"/>
+      </w:tblGrid>
+      <w:tr>
+        <w:trPr>
+          <w:cantSplit/>
+        </w:trPr>
+        <w:tc>
+          <w:tcPr>
+            <w:tcW w:type="dxa" w:w="1899"/>
+            <w:tcMar>
+              <w:top w:w="25" w:type="dxa"/>
+              <w:start w:w="0" w:type="dxa"/>
+              <w:bottom w:w="15" w:type="dxa"/>
+              <w:end w:w="160" w:type="dxa"/>
+            </w:tcMar>
+          </w:tcPr>
+          <w:p>
+            <w:pPr>
+              <w:pStyle w:val="CVMeta"/>
+              <w:widowControl/>
+              <w:jc w:val="right"/>
+            </w:pPr>
+            <w:r>
+              <w:rPr>
+                <w:b/>
+                <w:color w:val="1F4E79"/>
+              </w:rPr>
+              <w:t>Interests</w:t>
+            </w:r>
+          </w:p>
+        </w:tc>
+        <w:tc>
+          <w:tcPr>
+            <w:tcW w:type="dxa" w:w="8107"/>
+            <w:tcMar>
+              <w:top w:w="25" w:type="dxa"/>
+              <w:start w:w="90" w:type="dxa"/>
+              <w:bottom w:w="15" w:type="dxa"/>
+              <w:end w:w="0" w:type="dxa"/>
+            </w:tcMar>
+          </w:tcPr>
+          <w:p>
+            <w:pPr>
+              <w:widowControl/>
+              <w:spacing w:after="16"/>
+            </w:pPr>
+            <w:r>
+              <w:t>Classical guitar; cooking; geopolitics.</w:t>
+            </w:r>
+          </w:p>
+        </w:tc>
+      </w:tr>
+    </w:tbl>
     <w:sectPr>
-      <w:headerReference w:type="default" r:id="rId9"/>
-      <w:footerReference w:type="default" r:id="rId10"/>
-      <w:pgSz w:w="12240" w:h="15840"/>
-      <w:pgMar w:top="1080" w:right="1440" w:bottom="1008" w:left="1440" w:header="504" w:footer="504" w:gutter="0"/>
+      <w:footerReference w:type="default" r:id="rId13"/>
+      <w:pgSz w:w="11906" w:h="16838"/>
+      <w:pgMar w:top="765" w:right="822" w:bottom="709" w:left="822" w:header="283" w:footer="312" w:gutter="0"/>
       <w:cols w:space="720"/>
       <w:docGrid w:linePitch="360"/>
     </w:sectPr>
@@ -1151,72 +2102,15 @@
 <w:ftr xmlns:m="http://schemas.openxmlformats.org/officeDocument/2006/math" xmlns:mc="http://schemas.openxmlformats.org/markup-compatibility/2006" xmlns:mo="http://schemas.microsoft.com/office/mac/office/2008/main" xmlns:mv="urn:schemas-microsoft-com:mac:vml" xmlns:o="urn:schemas-microsoft-com:office:office" xmlns:r="http://schemas.openxmlformats.org/officeDocument/2006/relationships" xmlns:v="urn:schemas-microsoft-com:vml" xmlns:w10="urn:schemas-microsoft-com:office:word" xmlns:w14="http://schemas.microsoft.com/office/word/2010/wordml" xmlns:w="http://schemas.openxmlformats.org/wordprocessingml/2006/main" xmlns:wne="http://schemas.microsoft.com/office/word/2006/wordml" xmlns:wp14="http://schemas.microsoft.com/office/word/2010/wordprocessingDrawing" xmlns:wp="http://schemas.openxmlformats.org/drawingml/2006/wordprocessingDrawing" xmlns:wpc="http://schemas.microsoft.com/office/word/2010/wordprocessingCanvas" xmlns:wpg="http://schemas.microsoft.com/office/word/2010/wordprocessingGroup" xmlns:wpi="http://schemas.microsoft.com/office/word/2010/wordprocessingInk" xmlns:wps="http://schemas.microsoft.com/office/word/2010/wordprocessingShape" mc:Ignorable="w14 wp14">
   <w:p>
     <w:pPr>
-      <w:pStyle w:val="Footer"/>
-      <w:tabs>
-        <w:tab w:pos="9360" w:val="right"/>
-      </w:tabs>
-      <w:spacing w:before="0" w:after="0" w:line="240" w:lineRule="auto"/>
-    </w:pPr>
-    <w:hyperlink r:id="rId1">
-      <w:r>
-        <w:rPr>
-          <w:rFonts w:ascii="Arial" w:hAnsi="Arial"/>
-          <w:color w:val="5B4F3D"/>
-          <w:sz w:val="16"/>
-        </w:rPr>
-        <w:t>www.lmarinelli.eu</w:t>
-      </w:r>
-    </w:hyperlink>
+      <w:pStyle w:val="CVSmall"/>
+      <w:jc w:val="center"/>
+    </w:pPr>
     <w:r>
-      <w:rPr>
-        <w:rFonts w:ascii="Arial" w:hAnsi="Arial" w:cs="Arial"/>
-        <w:color w:val="5B4F3D"/>
-        <w:sz w:val="16"/>
-      </w:rPr>
-      <w:tab/>
+      <w:t xml:space="preserve">Lorenzo Marinelli | Curriculum Vitae | </w:t>
     </w:r>
-    <w:r>
-      <w:rPr>
-        <w:rFonts w:ascii="Arial" w:hAnsi="Arial" w:cs="Arial"/>
-        <w:color w:val="5B4F3D"/>
-        <w:sz w:val="16"/>
-      </w:rPr>
-      <w:t xml:space="preserve">Page </w:t>
-    </w:r>
-    <w:r>
-      <w:rPr>
-        <w:rFonts w:ascii="Arial" w:hAnsi="Arial" w:cs="Arial"/>
-        <w:color w:val="5B4F3D"/>
-        <w:sz w:val="17"/>
-      </w:rPr>
-      <w:fldChar w:fldCharType="begin"/>
-      <w:instrText xml:space="preserve"> PAGE </w:instrText>
-      <w:fldChar w:fldCharType="separate"/>
-      <w:fldChar w:fldCharType="end"/>
-    </w:r>
+    <w:fldSimple w:instr="PAGE"/>
   </w:p>
 </w:ftr>
-</file>
-
-<file path=word/header1.xml><?xml version="1.0" encoding="utf-8"?>
-<w:hdr xmlns:m="http://schemas.openxmlformats.org/officeDocument/2006/math" xmlns:mc="http://schemas.openxmlformats.org/markup-compatibility/2006" xmlns:mo="http://schemas.microsoft.com/office/mac/office/2008/main" xmlns:mv="urn:schemas-microsoft-com:mac:vml" xmlns:o="urn:schemas-microsoft-com:office:office" xmlns:r="http://schemas.openxmlformats.org/officeDocument/2006/relationships" xmlns:v="urn:schemas-microsoft-com:vml" xmlns:w10="urn:schemas-microsoft-com:office:word" xmlns:w14="http://schemas.microsoft.com/office/word/2010/wordml" xmlns:w="http://schemas.openxmlformats.org/wordprocessingml/2006/main" xmlns:wne="http://schemas.microsoft.com/office/word/2006/wordml" xmlns:wp14="http://schemas.microsoft.com/office/word/2010/wordprocessingDrawing" xmlns:wp="http://schemas.openxmlformats.org/drawingml/2006/wordprocessingDrawing" xmlns:wpc="http://schemas.microsoft.com/office/word/2010/wordprocessingCanvas" xmlns:wpg="http://schemas.microsoft.com/office/word/2010/wordprocessingGroup" xmlns:wpi="http://schemas.microsoft.com/office/word/2010/wordprocessingInk" xmlns:wps="http://schemas.microsoft.com/office/word/2010/wordprocessingShape" mc:Ignorable="w14 wp14">
-  <w:p>
-    <w:pPr>
-      <w:pStyle w:val="Header"/>
-      <w:spacing w:before="0" w:after="0" w:line="240" w:lineRule="auto"/>
-      <w:jc w:val="right"/>
-    </w:pPr>
-    <w:r>
-      <w:rPr>
-        <w:rFonts w:ascii="Arial" w:hAnsi="Arial" w:cs="Arial"/>
-        <w:b/>
-        <w:color w:val="005A56"/>
-        <w:sz w:val="15"/>
-      </w:rPr>
-      <w:t>LORENZO MARINELLI  |  CURRICULUM VITAE</w:t>
-    </w:r>
-  </w:p>
-</w:hdr>
 </file>
 
 <file path=word/numbering.xml><?xml version="1.0" encoding="utf-8"?>
@@ -1583,12 +2477,11 @@
     <w:qFormat/>
     <w:rsid w:val="00FC693F"/>
     <w:pPr>
-      <w:spacing w:after="80" w:line="269" w:lineRule="auto"/>
+      <w:spacing w:after="30" w:line="240" w:lineRule="auto"/>
     </w:pPr>
     <w:rPr>
-      <w:rFonts w:ascii="Arial" w:hAnsi="Arial"/>
-      <w:color w:val="1B1710"/>
-      <w:sz w:val="19"/>
+      <w:rFonts w:ascii="Arial" w:hAnsi="Arial" w:eastAsia="Arial"/>
+      <w:sz w:val="18"/>
     </w:rPr>
   </w:style>
   <w:style w:type="paragraph" w:styleId="Header">
@@ -1646,14 +2539,14 @@
     <w:pPr>
       <w:keepNext/>
       <w:keepLines/>
-      <w:spacing w:before="200" w:after="100"/>
+      <w:spacing w:before="480" w:after="0"/>
       <w:outlineLvl w:val="0"/>
     </w:pPr>
     <w:rPr>
-      <w:rFonts w:asciiTheme="majorHAnsi" w:eastAsiaTheme="majorEastAsia" w:hAnsiTheme="majorHAnsi" w:cstheme="majorBidi" w:ascii="Georgia" w:hAnsi="Georgia"/>
+      <w:rFonts w:asciiTheme="majorHAnsi" w:eastAsiaTheme="majorEastAsia" w:hAnsiTheme="majorHAnsi" w:cstheme="majorBidi"/>
       <w:b/>
       <w:bCs/>
-      <w:color w:val="966E00"/>
+      <w:color w:val="365F91" w:themeColor="accent1" w:themeShade="BF"/>
       <w:sz w:val="28"/>
       <w:szCs w:val="28"/>
     </w:rPr>
@@ -1670,15 +2563,15 @@
     <w:pPr>
       <w:keepNext/>
       <w:keepLines/>
-      <w:spacing w:before="100" w:after="20"/>
+      <w:spacing w:before="200" w:after="0"/>
       <w:outlineLvl w:val="1"/>
     </w:pPr>
     <w:rPr>
-      <w:rFonts w:asciiTheme="majorHAnsi" w:eastAsiaTheme="majorEastAsia" w:hAnsiTheme="majorHAnsi" w:cstheme="majorBidi" w:ascii="Arial" w:hAnsi="Arial"/>
+      <w:rFonts w:asciiTheme="majorHAnsi" w:eastAsiaTheme="majorEastAsia" w:hAnsiTheme="majorHAnsi" w:cstheme="majorBidi"/>
       <w:b/>
       <w:bCs/>
-      <w:color w:val="005A56"/>
-      <w:sz w:val="21"/>
+      <w:color w:val="4F81BD" w:themeColor="accent1"/>
+      <w:sz w:val="26"/>
       <w:szCs w:val="26"/>
     </w:rPr>
   </w:style>
@@ -1694,15 +2587,14 @@
     <w:pPr>
       <w:keepNext/>
       <w:keepLines/>
-      <w:spacing w:before="60" w:after="20"/>
+      <w:spacing w:before="200" w:after="0"/>
       <w:outlineLvl w:val="2"/>
     </w:pPr>
     <w:rPr>
-      <w:rFonts w:asciiTheme="majorHAnsi" w:eastAsiaTheme="majorEastAsia" w:hAnsiTheme="majorHAnsi" w:cstheme="majorBidi" w:ascii="Arial" w:hAnsi="Arial"/>
+      <w:rFonts w:asciiTheme="majorHAnsi" w:eastAsiaTheme="majorEastAsia" w:hAnsiTheme="majorHAnsi" w:cstheme="majorBidi"/>
       <w:b/>
       <w:bCs/>
-      <w:color w:val="C10030"/>
-      <w:sz w:val="19"/>
+      <w:color w:val="4F81BD" w:themeColor="accent1"/>
     </w:rPr>
   </w:style>
   <w:style w:type="paragraph" w:styleId="Heading4">
@@ -1933,16 +2825,18 @@
     <w:qFormat/>
     <w:rsid w:val="00FC693F"/>
     <w:pPr>
-      <w:spacing w:after="60" w:line="240" w:lineRule="auto" w:before="0"/>
+      <w:pBdr>
+        <w:bottom w:val="single" w:sz="8" w:space="4" w:color="4F81BD" w:themeColor="accent1"/>
+      </w:pBdr>
+      <w:spacing w:after="300" w:line="240" w:lineRule="auto"/>
       <w:contextualSpacing/>
     </w:pPr>
     <w:rPr>
-      <w:rFonts w:asciiTheme="majorHAnsi" w:eastAsiaTheme="majorEastAsia" w:hAnsiTheme="majorHAnsi" w:cstheme="majorBidi" w:ascii="Georgia" w:hAnsi="Georgia"/>
-      <w:b/>
-      <w:color w:val="1B1710"/>
+      <w:rFonts w:asciiTheme="majorHAnsi" w:eastAsiaTheme="majorEastAsia" w:hAnsiTheme="majorHAnsi" w:cstheme="majorBidi"/>
+      <w:color w:val="17365D" w:themeColor="text2" w:themeShade="BF"/>
       <w:spacing w:val="5"/>
       <w:kern w:val="28"/>
-      <w:sz w:val="60"/>
+      <w:sz w:val="52"/>
       <w:szCs w:val="52"/>
     </w:rPr>
   </w:style>
@@ -1973,16 +2867,14 @@
       <w:numPr>
         <w:ilvl w:val="1"/>
       </w:numPr>
-      <w:spacing w:before="0" w:after="160"/>
     </w:pPr>
     <w:rPr>
-      <w:rFonts w:asciiTheme="majorHAnsi" w:eastAsiaTheme="majorEastAsia" w:hAnsiTheme="majorHAnsi" w:cstheme="majorBidi" w:ascii="Arial" w:hAnsi="Arial"/>
-      <w:b w:val="0"/>
-      <w:i w:val="0"/>
+      <w:rFonts w:asciiTheme="majorHAnsi" w:eastAsiaTheme="majorEastAsia" w:hAnsiTheme="majorHAnsi" w:cstheme="majorBidi"/>
+      <w:i/>
       <w:iCs/>
-      <w:color w:val="005A56"/>
+      <w:color w:val="4F81BD" w:themeColor="accent1"/>
       <w:spacing w:val="15"/>
-      <w:sz w:val="25"/>
+      <w:sz w:val="24"/>
       <w:szCs w:val="24"/>
     </w:rPr>
   </w:style>
@@ -2118,15 +3010,8 @@
       <w:numPr>
         <w:numId w:val="1"/>
       </w:numPr>
-      <w:spacing w:after="50" w:line="264" w:lineRule="auto"/>
-      <w:ind w:left="432" w:hanging="230"/>
       <w:contextualSpacing/>
     </w:pPr>
-    <w:rPr>
-      <w:rFonts w:ascii="Arial" w:hAnsi="Arial"/>
-      <w:color w:val="1B1710"/>
-      <w:sz w:val="18"/>
-    </w:rPr>
   </w:style>
   <w:style w:type="paragraph" w:styleId="ListBullet2">
     <w:name w:val="List Bullet 2"/>
@@ -13281,28 +14166,76 @@
       </w:tcPr>
     </w:tblStylePr>
   </w:style>
+  <w:style w:type="paragraph" w:customStyle="1" w:styleId="CVName">
+    <w:name w:val="CV Name"/>
+    <w:pPr>
+      <w:spacing w:before="0" w:after="10"/>
+    </w:pPr>
+    <w:rPr>
+      <w:rFonts w:ascii="Arial" w:hAnsi="Arial" w:eastAsia="Arial"/>
+      <w:b/>
+      <w:color w:val="1F4E79"/>
+      <w:sz w:val="45"/>
+    </w:rPr>
+  </w:style>
+  <w:style w:type="paragraph" w:customStyle="1" w:styleId="CVSubtitle">
+    <w:name w:val="CV Subtitle"/>
+    <w:pPr>
+      <w:spacing w:before="0" w:after="90"/>
+    </w:pPr>
+    <w:rPr>
+      <w:rFonts w:ascii="Arial" w:hAnsi="Arial" w:eastAsia="Arial"/>
+      <w:b w:val="0"/>
+      <w:color w:val="666666"/>
+      <w:sz w:val="18"/>
+    </w:rPr>
+  </w:style>
+  <w:style w:type="paragraph" w:customStyle="1" w:styleId="CVSection">
+    <w:name w:val="CV Section"/>
+    <w:pPr>
+      <w:spacing w:before="140" w:after="60"/>
+    </w:pPr>
+    <w:rPr>
+      <w:rFonts w:ascii="Arial" w:hAnsi="Arial" w:eastAsia="Arial"/>
+      <w:b/>
+      <w:color w:val="1F4E79"/>
+      <w:sz w:val="20"/>
+    </w:rPr>
+  </w:style>
+  <w:style w:type="paragraph" w:customStyle="1" w:styleId="CVItemTitle">
+    <w:name w:val="CV ItemTitle"/>
+    <w:pPr>
+      <w:spacing w:before="0" w:after="0"/>
+    </w:pPr>
+    <w:rPr>
+      <w:rFonts w:ascii="Arial" w:hAnsi="Arial" w:eastAsia="Arial"/>
+      <w:b/>
+      <w:color w:val="222222"/>
+      <w:sz w:val="19"/>
+    </w:rPr>
+  </w:style>
   <w:style w:type="paragraph" w:customStyle="1" w:styleId="CVMeta">
     <w:name w:val="CV Meta"/>
     <w:pPr>
-      <w:spacing w:after="40" w:line="240" w:lineRule="auto"/>
+      <w:spacing w:before="0" w:after="0"/>
     </w:pPr>
     <w:rPr>
-      <w:rFonts w:ascii="Arial" w:hAnsi="Arial"/>
-      <w:i/>
-      <w:color w:val="5B4F3D"/>
+      <w:rFonts w:ascii="Arial" w:hAnsi="Arial" w:eastAsia="Arial"/>
+      <w:b w:val="0"/>
+      <w:color w:val="666666"/>
       <w:sz w:val="17"/>
     </w:rPr>
   </w:style>
-  <w:style w:type="paragraph" w:customStyle="1" w:styleId="CVEntry">
-    <w:name w:val="CV Entry"/>
-    <w:pPr>
-      <w:keepNext/>
-      <w:spacing w:after="20"/>
+  <w:style w:type="paragraph" w:customStyle="1" w:styleId="CVSmall">
+    <w:name w:val="CV Small"/>
+    <w:pPr>
+      <w:spacing w:before="0" w:after="0"/>
     </w:pPr>
     <w:rPr>
-      <w:rFonts w:ascii="Arial" w:hAnsi="Arial"/>
-      <w:color w:val="1B1710"/>
-      <w:sz w:val="19"/>
+      <w:rFonts w:ascii="Arial" w:hAnsi="Arial" w:eastAsia="Arial"/>
+      <w:b w:val="0"/>
+      <w:color w:val="666666"/>
+      <w:sz w:val="16"/>
     </w:rPr>
   </w:style>
 </w:styles>

</xml_diff>